<commit_message>
Added script to install certificates
</commit_message>
<xml_diff>
--- a/Doku/Anleitung.docx
+++ b/Doku/Anleitung.docx
@@ -584,7 +584,28 @@
           <w:szCs w:val="28"/>
           <w:lang w:val="de-DE"/>
         </w:rPr>
-        <w:t xml:space="preserve">(Optional) </w:t>
+        <w:t>(</w:t>
+      </w:r>
+      <w:r>
+        <w:rPr>
+          <w:rFonts w:ascii="Calibri" w:hAnsi="Calibri" w:cs="Calibri"/>
+          <w:b/>
+          <w:bCs/>
+          <w:color w:val="FF0000"/>
+          <w:sz w:val="28"/>
+          <w:szCs w:val="28"/>
+          <w:lang w:val="de-DE"/>
+        </w:rPr>
+        <w:t>Optional</w:t>
+      </w:r>
+      <w:r>
+        <w:rPr>
+          <w:rFonts w:ascii="Calibri" w:hAnsi="Calibri" w:cs="Calibri"/>
+          <w:sz w:val="28"/>
+          <w:szCs w:val="28"/>
+          <w:lang w:val="de-DE"/>
+        </w:rPr>
+        <w:t xml:space="preserve">) </w:t>
       </w:r>
       <w:r>
         <w:rPr>
@@ -793,83 +814,655 @@
     </w:p>
     <w:p>
       <w:pPr>
-        <w:spacing w:before="240" w:after="0" w:line="240" w:lineRule="auto"/>
-        <w:ind w:left="70" w:right="-425"/>
-        <w:jc w:val="both"/>
-        <w:rPr>
-          <w:rFonts w:ascii="Calibri" w:hAnsi="Calibri" w:cs="Calibri"/>
-          <w:sz w:val="28"/>
-          <w:szCs w:val="28"/>
-          <w:lang w:val="de-DE"/>
-        </w:rPr>
-      </w:pPr>
-      <w:r>
-        <w:rPr>
-          <w:rFonts w:ascii="Calibri" w:hAnsi="Calibri" w:cs="Calibri"/>
-          <w:b/>
-          <w:bCs/>
-          <w:sz w:val="28"/>
-          <w:szCs w:val="28"/>
-          <w:lang w:val="de-DE"/>
-        </w:rPr>
-        <w:t>2-</w:t>
-      </w:r>
-      <w:r>
-        <w:rPr>
-          <w:rFonts w:ascii="Calibri" w:hAnsi="Calibri" w:cs="Calibri"/>
-          <w:sz w:val="28"/>
-          <w:szCs w:val="28"/>
-          <w:lang w:val="de-DE"/>
-        </w:rPr>
-        <w:t xml:space="preserve"> </w:t>
-      </w:r>
-      <w:r>
-        <w:rPr>
-          <w:rFonts w:ascii="Calibri" w:hAnsi="Calibri" w:cs="Calibri"/>
-          <w:b/>
-          <w:bCs/>
-          <w:sz w:val="28"/>
-          <w:szCs w:val="28"/>
-          <w:lang w:val="de-DE"/>
-        </w:rPr>
-        <w:t>'ClewareUSBServer.exe'</w:t>
-      </w:r>
-      <w:r>
-        <w:rPr>
-          <w:rFonts w:ascii="Calibri" w:hAnsi="Calibri" w:cs="Calibri"/>
-          <w:sz w:val="28"/>
-          <w:szCs w:val="28"/>
-          <w:lang w:val="de-DE"/>
-        </w:rPr>
-        <w:t xml:space="preserve"> auf PowerPC ausführen</w:t>
-      </w:r>
-    </w:p>
-    <w:p>
-      <w:pPr>
         <w:pStyle w:val="ListParagraph"/>
         <w:numPr>
           <w:ilvl w:val="0"/>
-          <w:numId w:val="13"/>
+          <w:numId w:val="12"/>
         </w:numPr>
         <w:spacing w:before="240" w:after="0" w:line="240" w:lineRule="auto"/>
         <w:ind w:right="-425"/>
         <w:jc w:val="both"/>
         <w:rPr>
           <w:rFonts w:ascii="Calibri" w:hAnsi="Calibri" w:cs="Calibri"/>
-          <w:sz w:val="28"/>
-          <w:szCs w:val="28"/>
-          <w:lang w:val="de-DE"/>
-        </w:rPr>
-      </w:pPr>
-      <w:r>
-        <w:rPr>
-          <w:rFonts w:ascii="Calibri" w:hAnsi="Calibri" w:cs="Calibri"/>
           <w:b/>
           <w:bCs/>
           <w:sz w:val="28"/>
           <w:szCs w:val="28"/>
           <w:lang w:val="de-DE"/>
         </w:rPr>
+      </w:pPr>
+      <w:r>
+        <w:rPr>
+          <w:rFonts w:ascii="Calibri" w:hAnsi="Calibri" w:cs="Calibri"/>
+          <w:b/>
+          <w:bCs/>
+          <w:sz w:val="28"/>
+          <w:szCs w:val="28"/>
+          <w:lang w:val="de-DE"/>
+        </w:rPr>
+        <w:t>Auf Power PC:</w:t>
+      </w:r>
+    </w:p>
+    <w:p>
+      <w:pPr>
+        <w:pStyle w:val="ListParagraph"/>
+        <w:numPr>
+          <w:ilvl w:val="0"/>
+          <w:numId w:val="25"/>
+        </w:numPr>
+        <w:spacing w:before="240" w:after="0" w:line="240" w:lineRule="auto"/>
+        <w:ind w:right="-425"/>
+        <w:jc w:val="both"/>
+        <w:rPr>
+          <w:rFonts w:ascii="Calibri" w:hAnsi="Calibri" w:cs="Calibri"/>
+          <w:sz w:val="28"/>
+          <w:szCs w:val="28"/>
+          <w:lang w:val="de-DE"/>
+        </w:rPr>
+      </w:pPr>
+      <w:r>
+        <w:rPr>
+          <w:rFonts w:ascii="Calibri" w:hAnsi="Calibri" w:cs="Calibri"/>
+          <w:sz w:val="28"/>
+          <w:szCs w:val="28"/>
+          <w:lang w:val="de-DE"/>
+        </w:rPr>
+        <w:t>(</w:t>
+      </w:r>
+      <w:r>
+        <w:rPr>
+          <w:rFonts w:ascii="Calibri" w:hAnsi="Calibri" w:cs="Calibri"/>
+          <w:b/>
+          <w:bCs/>
+          <w:color w:val="FF0000"/>
+          <w:sz w:val="28"/>
+          <w:szCs w:val="28"/>
+          <w:lang w:val="de-DE"/>
+        </w:rPr>
+        <w:t>Einmalig</w:t>
+      </w:r>
+      <w:r>
+        <w:rPr>
+          <w:rFonts w:ascii="Calibri" w:hAnsi="Calibri" w:cs="Calibri"/>
+          <w:sz w:val="28"/>
+          <w:szCs w:val="28"/>
+          <w:lang w:val="de-DE"/>
+        </w:rPr>
+        <w:t xml:space="preserve">) </w:t>
+      </w:r>
+      <w:r>
+        <w:rPr>
+          <w:rFonts w:ascii="Calibri" w:hAnsi="Calibri" w:cs="Calibri"/>
+          <w:sz w:val="28"/>
+          <w:szCs w:val="28"/>
+          <w:lang w:val="de-DE"/>
+        </w:rPr>
+        <w:t xml:space="preserve">Inbound Rule anlegen: Bei erster Ausführung des Programs auf einem PC an dem die USB Power Switches angeschlossen sind </w:t>
+      </w:r>
+      <w:r>
+        <w:rPr>
+          <w:rFonts w:ascii="Calibri" w:hAnsi="Calibri" w:cs="Calibri"/>
+          <w:sz w:val="28"/>
+          <w:szCs w:val="28"/>
+          <w:lang w:val="de-DE"/>
+        </w:rPr>
+        <w:t>muss</w:t>
+      </w:r>
+      <w:r>
+        <w:rPr>
+          <w:rFonts w:ascii="Calibri" w:hAnsi="Calibri" w:cs="Calibri"/>
+          <w:sz w:val="28"/>
+          <w:szCs w:val="28"/>
+          <w:lang w:val="de-DE"/>
+        </w:rPr>
+        <w:t xml:space="preserve"> eine </w:t>
+      </w:r>
+      <w:r>
+        <w:rPr>
+          <w:rFonts w:ascii="Calibri" w:hAnsi="Calibri" w:cs="Calibri"/>
+          <w:b/>
+          <w:bCs/>
+          <w:sz w:val="28"/>
+          <w:szCs w:val="28"/>
+          <w:lang w:val="de-DE"/>
+        </w:rPr>
+        <w:t>Inbound Regel</w:t>
+      </w:r>
+      <w:r>
+        <w:rPr>
+          <w:rFonts w:ascii="Calibri" w:hAnsi="Calibri" w:cs="Calibri"/>
+          <w:sz w:val="28"/>
+          <w:szCs w:val="28"/>
+          <w:lang w:val="de-DE"/>
+        </w:rPr>
+        <w:t xml:space="preserve"> im Firewall an</w:t>
+      </w:r>
+      <w:r>
+        <w:rPr>
+          <w:rFonts w:ascii="Calibri" w:hAnsi="Calibri" w:cs="Calibri"/>
+          <w:sz w:val="28"/>
+          <w:szCs w:val="28"/>
+          <w:lang w:val="de-DE"/>
+        </w:rPr>
+        <w:t>gelegt werden</w:t>
+      </w:r>
+      <w:r>
+        <w:rPr>
+          <w:rFonts w:ascii="Calibri" w:hAnsi="Calibri" w:cs="Calibri"/>
+          <w:sz w:val="28"/>
+          <w:szCs w:val="28"/>
+          <w:lang w:val="de-DE"/>
+        </w:rPr>
+        <w:t xml:space="preserve"> u</w:t>
+      </w:r>
+      <w:r>
+        <w:rPr>
+          <w:rFonts w:ascii="Calibri" w:hAnsi="Calibri" w:cs="Calibri"/>
+          <w:sz w:val="28"/>
+          <w:szCs w:val="28"/>
+          <w:lang w:val="de-DE"/>
+        </w:rPr>
+        <w:t>m</w:t>
+      </w:r>
+      <w:r>
+        <w:rPr>
+          <w:rFonts w:ascii="Calibri" w:hAnsi="Calibri" w:cs="Calibri"/>
+          <w:sz w:val="28"/>
+          <w:szCs w:val="28"/>
+          <w:lang w:val="de-DE"/>
+        </w:rPr>
+        <w:t xml:space="preserve"> d</w:t>
+      </w:r>
+      <w:r>
+        <w:rPr>
+          <w:rFonts w:ascii="Calibri" w:hAnsi="Calibri" w:cs="Calibri"/>
+          <w:sz w:val="28"/>
+          <w:szCs w:val="28"/>
+          <w:lang w:val="de-DE"/>
+        </w:rPr>
+        <w:t>ie</w:t>
+      </w:r>
+      <w:r>
+        <w:rPr>
+          <w:rFonts w:ascii="Calibri" w:hAnsi="Calibri" w:cs="Calibri"/>
+          <w:sz w:val="28"/>
+          <w:szCs w:val="28"/>
+          <w:lang w:val="de-DE"/>
+        </w:rPr>
+        <w:t xml:space="preserve"> verwendete</w:t>
+      </w:r>
+      <w:r>
+        <w:rPr>
+          <w:rFonts w:ascii="Calibri" w:hAnsi="Calibri" w:cs="Calibri"/>
+          <w:sz w:val="28"/>
+          <w:szCs w:val="28"/>
+          <w:lang w:val="de-DE"/>
+        </w:rPr>
+        <w:t>n</w:t>
+      </w:r>
+      <w:r>
+        <w:rPr>
+          <w:rFonts w:ascii="Calibri" w:hAnsi="Calibri" w:cs="Calibri"/>
+          <w:sz w:val="28"/>
+          <w:szCs w:val="28"/>
+          <w:lang w:val="de-DE"/>
+        </w:rPr>
+        <w:t xml:space="preserve"> Port</w:t>
+      </w:r>
+      <w:r>
+        <w:rPr>
+          <w:rFonts w:ascii="Calibri" w:hAnsi="Calibri" w:cs="Calibri"/>
+          <w:sz w:val="28"/>
+          <w:szCs w:val="28"/>
+          <w:lang w:val="de-DE"/>
+        </w:rPr>
+        <w:t>s</w:t>
+      </w:r>
+      <w:r>
+        <w:rPr>
+          <w:rFonts w:ascii="Calibri" w:hAnsi="Calibri" w:cs="Calibri"/>
+          <w:sz w:val="28"/>
+          <w:szCs w:val="28"/>
+          <w:lang w:val="de-DE"/>
+        </w:rPr>
+        <w:t xml:space="preserve"> </w:t>
+      </w:r>
+      <w:r>
+        <w:rPr>
+          <w:rFonts w:ascii="Calibri" w:hAnsi="Calibri" w:cs="Calibri"/>
+          <w:sz w:val="28"/>
+          <w:szCs w:val="28"/>
+          <w:lang w:val="de-DE"/>
+        </w:rPr>
+        <w:t xml:space="preserve">im Firewall </w:t>
+      </w:r>
+      <w:r>
+        <w:rPr>
+          <w:rFonts w:ascii="Calibri" w:hAnsi="Calibri" w:cs="Calibri"/>
+          <w:sz w:val="28"/>
+          <w:szCs w:val="28"/>
+          <w:lang w:val="de-DE"/>
+        </w:rPr>
+        <w:t>zu</w:t>
+      </w:r>
+      <w:r>
+        <w:rPr>
+          <w:rFonts w:ascii="Calibri" w:hAnsi="Calibri" w:cs="Calibri"/>
+          <w:sz w:val="28"/>
+          <w:szCs w:val="28"/>
+          <w:lang w:val="de-DE"/>
+        </w:rPr>
+        <w:t>zu</w:t>
+      </w:r>
+      <w:r>
+        <w:rPr>
+          <w:rFonts w:ascii="Calibri" w:hAnsi="Calibri" w:cs="Calibri"/>
+          <w:sz w:val="28"/>
+          <w:szCs w:val="28"/>
+          <w:lang w:val="de-DE"/>
+        </w:rPr>
+        <w:t xml:space="preserve">lassen, damit eine Verbindung außerhalb des Arbeitsplatzes möglich ist: Firewall öffnen -&gt; </w:t>
+      </w:r>
+      <w:r>
+        <w:rPr>
+          <w:rFonts w:ascii="Calibri" w:hAnsi="Calibri" w:cs="Calibri"/>
+          <w:sz w:val="28"/>
+          <w:szCs w:val="28"/>
+          <w:lang w:val="de-DE"/>
+        </w:rPr>
+        <w:t xml:space="preserve">Firewall und </w:t>
+      </w:r>
+      <w:r>
+        <w:rPr>
+          <w:rFonts w:ascii="Calibri" w:hAnsi="Calibri" w:cs="Calibri"/>
+          <w:sz w:val="28"/>
+          <w:szCs w:val="28"/>
+          <w:lang w:val="de-DE"/>
+        </w:rPr>
+        <w:t>Netwerkschutz -&gt; Erweiterte Einstellungen -&gt; Inbound Rules -&gt; New Rule -&gt; Port -&gt; verwendete Ports eingeben</w:t>
+      </w:r>
+      <w:r>
+        <w:rPr>
+          <w:rFonts w:ascii="Calibri" w:hAnsi="Calibri" w:cs="Calibri"/>
+          <w:sz w:val="28"/>
+          <w:szCs w:val="28"/>
+          <w:lang w:val="de-DE"/>
+        </w:rPr>
+        <w:t xml:space="preserve"> (59001, 8080)</w:t>
+      </w:r>
+      <w:r>
+        <w:rPr>
+          <w:rFonts w:ascii="Calibri" w:hAnsi="Calibri" w:cs="Calibri"/>
+          <w:sz w:val="28"/>
+          <w:szCs w:val="28"/>
+          <w:lang w:val="de-DE"/>
+        </w:rPr>
+        <w:t xml:space="preserve"> und weiter bis beenden.</w:t>
+      </w:r>
+    </w:p>
+    <w:p>
+      <w:pPr>
+        <w:pStyle w:val="ListParagraph"/>
+        <w:numPr>
+          <w:ilvl w:val="0"/>
+          <w:numId w:val="25"/>
+        </w:numPr>
+        <w:spacing w:before="240" w:after="0" w:line="240" w:lineRule="auto"/>
+        <w:ind w:right="-425"/>
+        <w:jc w:val="both"/>
+        <w:rPr>
+          <w:rFonts w:ascii="Calibri" w:hAnsi="Calibri" w:cs="Calibri"/>
+          <w:sz w:val="28"/>
+          <w:szCs w:val="28"/>
+        </w:rPr>
+      </w:pPr>
+      <w:r>
+        <w:rPr>
+          <w:rFonts w:ascii="Calibri" w:hAnsi="Calibri" w:cs="Calibri"/>
+          <w:sz w:val="28"/>
+          <w:szCs w:val="28"/>
+          <w:lang w:val="de-DE"/>
+        </w:rPr>
+        <w:t>(</w:t>
+      </w:r>
+      <w:r>
+        <w:rPr>
+          <w:rFonts w:ascii="Calibri" w:hAnsi="Calibri" w:cs="Calibri"/>
+          <w:b/>
+          <w:bCs/>
+          <w:color w:val="FF0000"/>
+          <w:sz w:val="28"/>
+          <w:szCs w:val="28"/>
+          <w:lang w:val="de-DE"/>
+        </w:rPr>
+        <w:t>Einmalig</w:t>
+      </w:r>
+      <w:r>
+        <w:rPr>
+          <w:rFonts w:ascii="Calibri" w:hAnsi="Calibri" w:cs="Calibri"/>
+          <w:sz w:val="28"/>
+          <w:szCs w:val="28"/>
+          <w:lang w:val="de-DE"/>
+        </w:rPr>
+        <w:t xml:space="preserve">) </w:t>
+      </w:r>
+      <w:r>
+        <w:rPr>
+          <w:rFonts w:ascii="Calibri" w:hAnsi="Calibri" w:cs="Calibri"/>
+          <w:sz w:val="28"/>
+          <w:szCs w:val="28"/>
+        </w:rPr>
+        <w:t xml:space="preserve">Executable -&gt; Certificates -&gt; intall-mkcert.ps1 </w:t>
+      </w:r>
+      <w:proofErr w:type="spellStart"/>
+      <w:r>
+        <w:rPr>
+          <w:rFonts w:ascii="Calibri" w:hAnsi="Calibri" w:cs="Calibri"/>
+          <w:sz w:val="28"/>
+          <w:szCs w:val="28"/>
+        </w:rPr>
+        <w:t>als</w:t>
+      </w:r>
+      <w:proofErr w:type="spellEnd"/>
+      <w:r>
+        <w:rPr>
+          <w:rFonts w:ascii="Calibri" w:hAnsi="Calibri" w:cs="Calibri"/>
+          <w:sz w:val="28"/>
+          <w:szCs w:val="28"/>
+        </w:rPr>
+        <w:t xml:space="preserve"> Admin </w:t>
+      </w:r>
+      <w:proofErr w:type="spellStart"/>
+      <w:r>
+        <w:rPr>
+          <w:rFonts w:ascii="Calibri" w:hAnsi="Calibri" w:cs="Calibri"/>
+          <w:sz w:val="28"/>
+          <w:szCs w:val="28"/>
+        </w:rPr>
+        <w:t>ausführen</w:t>
+      </w:r>
+      <w:proofErr w:type="spellEnd"/>
+      <w:r>
+        <w:rPr>
+          <w:rFonts w:ascii="Calibri" w:hAnsi="Calibri" w:cs="Calibri"/>
+          <w:sz w:val="28"/>
+          <w:szCs w:val="28"/>
+        </w:rPr>
+        <w:t>.</w:t>
+      </w:r>
+    </w:p>
+    <w:p>
+      <w:pPr>
+        <w:pStyle w:val="ListParagraph"/>
+        <w:numPr>
+          <w:ilvl w:val="0"/>
+          <w:numId w:val="25"/>
+        </w:numPr>
+        <w:spacing w:before="240" w:after="0" w:line="240" w:lineRule="auto"/>
+        <w:ind w:right="-425"/>
+        <w:jc w:val="both"/>
+        <w:rPr>
+          <w:rFonts w:ascii="Calibri" w:hAnsi="Calibri" w:cs="Calibri"/>
+          <w:sz w:val="28"/>
+          <w:szCs w:val="28"/>
+        </w:rPr>
+      </w:pPr>
+      <w:r>
+        <w:rPr>
+          <w:rFonts w:ascii="Calibri" w:hAnsi="Calibri" w:cs="Calibri"/>
+          <w:sz w:val="28"/>
+          <w:szCs w:val="28"/>
+        </w:rPr>
+        <w:t>(</w:t>
+      </w:r>
+      <w:proofErr w:type="spellStart"/>
+      <w:r>
+        <w:rPr>
+          <w:rFonts w:ascii="Calibri" w:hAnsi="Calibri" w:cs="Calibri"/>
+          <w:b/>
+          <w:bCs/>
+          <w:color w:val="FF0000"/>
+          <w:sz w:val="28"/>
+          <w:szCs w:val="28"/>
+        </w:rPr>
+        <w:t>Einmalig</w:t>
+      </w:r>
+      <w:proofErr w:type="spellEnd"/>
+      <w:r>
+        <w:rPr>
+          <w:rFonts w:ascii="Calibri" w:hAnsi="Calibri" w:cs="Calibri"/>
+          <w:sz w:val="28"/>
+          <w:szCs w:val="28"/>
+        </w:rPr>
+        <w:t>)</w:t>
+      </w:r>
+      <w:r>
+        <w:rPr>
+          <w:rFonts w:ascii="Calibri" w:hAnsi="Calibri" w:cs="Calibri"/>
+          <w:sz w:val="28"/>
+          <w:szCs w:val="28"/>
+        </w:rPr>
+        <w:t xml:space="preserve"> </w:t>
+      </w:r>
+      <w:r>
+        <w:rPr>
+          <w:rFonts w:ascii="Calibri" w:hAnsi="Calibri" w:cs="Calibri"/>
+          <w:sz w:val="28"/>
+          <w:szCs w:val="28"/>
+        </w:rPr>
+        <w:t>Executable -&gt; Certificates -&gt;</w:t>
+      </w:r>
+      <w:r>
+        <w:rPr>
+          <w:rFonts w:ascii="Calibri" w:hAnsi="Calibri" w:cs="Calibri"/>
+          <w:sz w:val="28"/>
+          <w:szCs w:val="28"/>
+        </w:rPr>
+        <w:t xml:space="preserve"> rootCertificate.crt </w:t>
+      </w:r>
+      <w:proofErr w:type="spellStart"/>
+      <w:r>
+        <w:rPr>
+          <w:rFonts w:ascii="Calibri" w:hAnsi="Calibri" w:cs="Calibri"/>
+          <w:sz w:val="28"/>
+          <w:szCs w:val="28"/>
+        </w:rPr>
+        <w:t>öffnen</w:t>
+      </w:r>
+      <w:proofErr w:type="spellEnd"/>
+      <w:r>
+        <w:rPr>
+          <w:rFonts w:ascii="Calibri" w:hAnsi="Calibri" w:cs="Calibri"/>
+          <w:sz w:val="28"/>
+          <w:szCs w:val="28"/>
+        </w:rPr>
+        <w:t xml:space="preserve"> -&gt; install certificate -&gt; current user -&gt; Next -&gt; Place all </w:t>
+      </w:r>
+      <w:proofErr w:type="spellStart"/>
+      <w:r>
+        <w:rPr>
+          <w:rFonts w:ascii="Calibri" w:hAnsi="Calibri" w:cs="Calibri"/>
+          <w:sz w:val="28"/>
+          <w:szCs w:val="28"/>
+        </w:rPr>
+        <w:t>certifictaes</w:t>
+      </w:r>
+      <w:proofErr w:type="spellEnd"/>
+      <w:r>
+        <w:rPr>
+          <w:rFonts w:ascii="Calibri" w:hAnsi="Calibri" w:cs="Calibri"/>
+          <w:sz w:val="28"/>
+          <w:szCs w:val="28"/>
+        </w:rPr>
+        <w:t xml:space="preserve"> in the following store -&gt; Browse -&gt; “Trusted Root Certification Authorities” </w:t>
+      </w:r>
+      <w:proofErr w:type="spellStart"/>
+      <w:r>
+        <w:rPr>
+          <w:rFonts w:ascii="Calibri" w:hAnsi="Calibri" w:cs="Calibri"/>
+          <w:sz w:val="28"/>
+          <w:szCs w:val="28"/>
+        </w:rPr>
+        <w:t>auswählen</w:t>
+      </w:r>
+      <w:proofErr w:type="spellEnd"/>
+      <w:r>
+        <w:rPr>
+          <w:rFonts w:ascii="Calibri" w:hAnsi="Calibri" w:cs="Calibri"/>
+          <w:sz w:val="28"/>
+          <w:szCs w:val="28"/>
+        </w:rPr>
+        <w:t xml:space="preserve"> und auf OK </w:t>
+      </w:r>
+      <w:proofErr w:type="spellStart"/>
+      <w:r>
+        <w:rPr>
+          <w:rFonts w:ascii="Calibri" w:hAnsi="Calibri" w:cs="Calibri"/>
+          <w:sz w:val="28"/>
+          <w:szCs w:val="28"/>
+        </w:rPr>
+        <w:t>klicken</w:t>
+      </w:r>
+      <w:proofErr w:type="spellEnd"/>
+      <w:r>
+        <w:rPr>
+          <w:rFonts w:ascii="Calibri" w:hAnsi="Calibri" w:cs="Calibri"/>
+          <w:sz w:val="28"/>
+          <w:szCs w:val="28"/>
+        </w:rPr>
+        <w:t xml:space="preserve"> -&gt; Next -&gt; Finish</w:t>
+      </w:r>
+    </w:p>
+    <w:p>
+      <w:pPr>
+        <w:pStyle w:val="ListParagraph"/>
+        <w:numPr>
+          <w:ilvl w:val="0"/>
+          <w:numId w:val="25"/>
+        </w:numPr>
+        <w:spacing w:before="240" w:after="0" w:line="240" w:lineRule="auto"/>
+        <w:ind w:right="-425"/>
+        <w:jc w:val="both"/>
+        <w:rPr>
+          <w:rFonts w:ascii="Calibri" w:hAnsi="Calibri" w:cs="Calibri"/>
+          <w:sz w:val="28"/>
+          <w:szCs w:val="28"/>
+          <w:lang w:val="de-DE"/>
+        </w:rPr>
+      </w:pPr>
+      <w:r>
+        <w:rPr>
+          <w:rFonts w:ascii="Calibri" w:hAnsi="Calibri" w:cs="Calibri"/>
+          <w:b/>
+          <w:bCs/>
+          <w:sz w:val="28"/>
+          <w:szCs w:val="28"/>
+          <w:lang w:val="de-DE"/>
+        </w:rPr>
+        <w:t>'ClewareUSBServer.exe'</w:t>
+      </w:r>
+      <w:r>
+        <w:rPr>
+          <w:rFonts w:ascii="Calibri" w:hAnsi="Calibri" w:cs="Calibri"/>
+          <w:sz w:val="28"/>
+          <w:szCs w:val="28"/>
+          <w:lang w:val="de-DE"/>
+        </w:rPr>
+        <w:t xml:space="preserve"> als Administrator ausführen.</w:t>
+      </w:r>
+    </w:p>
+    <w:p>
+      <w:pPr>
+        <w:pStyle w:val="ListParagraph"/>
+        <w:spacing w:before="240" w:after="0" w:line="240" w:lineRule="auto"/>
+        <w:ind w:left="790" w:right="-425"/>
+        <w:jc w:val="both"/>
+        <w:rPr>
+          <w:rFonts w:ascii="Calibri" w:hAnsi="Calibri" w:cs="Calibri"/>
+          <w:sz w:val="28"/>
+          <w:szCs w:val="28"/>
+          <w:lang w:val="de-DE"/>
+        </w:rPr>
+      </w:pPr>
+    </w:p>
+    <w:p>
+      <w:pPr>
+        <w:pStyle w:val="ListParagraph"/>
+        <w:numPr>
+          <w:ilvl w:val="0"/>
+          <w:numId w:val="12"/>
+        </w:numPr>
+        <w:spacing w:before="240" w:after="0" w:line="240" w:lineRule="auto"/>
+        <w:ind w:right="-425"/>
+        <w:jc w:val="both"/>
+        <w:rPr>
+          <w:rFonts w:ascii="Calibri" w:hAnsi="Calibri" w:cs="Calibri"/>
+          <w:sz w:val="28"/>
+          <w:szCs w:val="28"/>
+          <w:lang w:val="de-DE"/>
+        </w:rPr>
+      </w:pPr>
+      <w:r>
+        <w:rPr>
+          <w:rFonts w:ascii="Calibri" w:hAnsi="Calibri" w:cs="Calibri"/>
+          <w:sz w:val="28"/>
+          <w:szCs w:val="28"/>
+          <w:lang w:val="de-DE"/>
+        </w:rPr>
+        <w:t>(</w:t>
+      </w:r>
+      <w:r>
+        <w:rPr>
+          <w:rFonts w:ascii="Calibri" w:hAnsi="Calibri" w:cs="Calibri"/>
+          <w:b/>
+          <w:bCs/>
+          <w:color w:val="FF0000"/>
+          <w:sz w:val="28"/>
+          <w:szCs w:val="28"/>
+          <w:lang w:val="de-DE"/>
+        </w:rPr>
+        <w:t>Optional</w:t>
+      </w:r>
+      <w:r>
+        <w:rPr>
+          <w:rFonts w:ascii="Calibri" w:hAnsi="Calibri" w:cs="Calibri"/>
+          <w:sz w:val="28"/>
+          <w:szCs w:val="28"/>
+          <w:lang w:val="de-DE"/>
+        </w:rPr>
+        <w:t>)</w:t>
+      </w:r>
+      <w:r>
+        <w:rPr>
+          <w:rFonts w:ascii="Calibri" w:hAnsi="Calibri" w:cs="Calibri"/>
+          <w:b/>
+          <w:bCs/>
+          <w:sz w:val="28"/>
+          <w:szCs w:val="28"/>
+          <w:lang w:val="de-DE"/>
+        </w:rPr>
+        <w:t xml:space="preserve"> </w:t>
+      </w:r>
+      <w:r>
+        <w:rPr>
+          <w:rFonts w:ascii="Calibri" w:hAnsi="Calibri" w:cs="Calibri"/>
+          <w:b/>
+          <w:bCs/>
+          <w:sz w:val="28"/>
+          <w:szCs w:val="28"/>
+          <w:lang w:val="de-DE"/>
+        </w:rPr>
+        <w:t xml:space="preserve">Auf Client PCs mit power Switches: </w:t>
+      </w:r>
+      <w:r>
+        <w:rPr>
+          <w:rFonts w:ascii="Calibri" w:hAnsi="Calibri" w:cs="Calibri"/>
+          <w:b/>
+          <w:bCs/>
+          <w:sz w:val="28"/>
+          <w:szCs w:val="28"/>
+          <w:lang w:val="de-DE"/>
+        </w:rPr>
         <w:t>'ClewareUSBClient.exe'</w:t>
       </w:r>
       <w:r>
@@ -879,25 +1472,16 @@
           <w:szCs w:val="28"/>
           <w:lang w:val="de-DE"/>
         </w:rPr>
-        <w:t xml:space="preserve"> auf Clients mit USB Switches starten. Serverinformationen eingeben</w:t>
-      </w:r>
-      <w:r>
-        <w:rPr>
-          <w:rFonts w:ascii="Calibri" w:hAnsi="Calibri" w:cs="Calibri"/>
-          <w:sz w:val="28"/>
-          <w:szCs w:val="28"/>
-          <w:lang w:val="de-DE"/>
-        </w:rPr>
-        <w:t>, speichern</w:t>
-      </w:r>
-      <w:r>
-        <w:rPr>
-          <w:rFonts w:ascii="Calibri" w:hAnsi="Calibri" w:cs="Calibri"/>
-          <w:sz w:val="28"/>
-          <w:szCs w:val="28"/>
-          <w:lang w:val="de-DE"/>
-        </w:rPr>
-        <w:t xml:space="preserve"> und verbinden.</w:t>
+        <w:t xml:space="preserve"> </w:t>
+      </w:r>
+      <w:r>
+        <w:rPr>
+          <w:rFonts w:ascii="Calibri" w:hAnsi="Calibri" w:cs="Calibri"/>
+          <w:sz w:val="28"/>
+          <w:szCs w:val="28"/>
+          <w:lang w:val="de-DE"/>
+        </w:rPr>
+        <w:t>starten. Serverinformationen eingeben, speichern und verbinden.</w:t>
       </w:r>
     </w:p>
     <w:p>
@@ -922,9 +1506,9 @@
           <w:lang w:val="de-DE"/>
         </w:rPr>
         <w:drawing>
-          <wp:inline distT="0" distB="0" distL="0" distR="0" wp14:anchorId="3119025C" wp14:editId="715D0746">
-            <wp:extent cx="2651760" cy="2075575"/>
-            <wp:effectExtent l="0" t="0" r="0" b="1270"/>
+          <wp:inline distT="0" distB="0" distL="0" distR="0" wp14:anchorId="3119025C" wp14:editId="674FFDD6">
+            <wp:extent cx="1969477" cy="1541541"/>
+            <wp:effectExtent l="0" t="0" r="0" b="1905"/>
             <wp:docPr id="1758278980" name="Picture 1"/>
             <wp:cNvGraphicFramePr>
               <a:graphicFrameLocks xmlns:a="http://schemas.openxmlformats.org/drawingml/2006/main" noChangeAspect="1"/>
@@ -945,7 +1529,7 @@
                   <pic:spPr>
                     <a:xfrm>
                       <a:off x="0" y="0"/>
-                      <a:ext cx="2654804" cy="2077957"/>
+                      <a:ext cx="1977781" cy="1548041"/>
                     </a:xfrm>
                     <a:prstGeom prst="rect">
                       <a:avLst/>
@@ -984,23 +1568,9 @@
     <w:p>
       <w:pPr>
         <w:pStyle w:val="ListParagraph"/>
-        <w:spacing w:before="240" w:after="0" w:line="240" w:lineRule="auto"/>
-        <w:ind w:left="430" w:right="-425"/>
-        <w:jc w:val="center"/>
-        <w:rPr>
-          <w:rFonts w:ascii="Calibri" w:hAnsi="Calibri" w:cs="Calibri"/>
-          <w:sz w:val="28"/>
-          <w:szCs w:val="28"/>
-          <w:lang w:val="de-DE"/>
-        </w:rPr>
-      </w:pPr>
-    </w:p>
-    <w:p>
-      <w:pPr>
-        <w:pStyle w:val="ListParagraph"/>
         <w:numPr>
           <w:ilvl w:val="0"/>
-          <w:numId w:val="13"/>
+          <w:numId w:val="12"/>
         </w:numPr>
         <w:spacing w:before="240" w:after="0" w:line="240" w:lineRule="auto"/>
         <w:ind w:right="-425"/>
@@ -1015,69 +1585,42 @@
       <w:r>
         <w:rPr>
           <w:rFonts w:ascii="Calibri" w:hAnsi="Calibri" w:cs="Calibri"/>
-          <w:sz w:val="28"/>
-          <w:szCs w:val="28"/>
-          <w:lang w:val="de-DE"/>
-        </w:rPr>
-        <w:t xml:space="preserve">Im Browser öffnen (Server): https://&lt;Serveradresse&gt;:8080 --&gt;z.B.: </w:t>
-      </w:r>
-      <w:r>
-        <w:rPr>
-          <w:rFonts w:ascii="Calibri" w:hAnsi="Calibri" w:cs="Calibri"/>
-          <w:sz w:val="28"/>
-          <w:szCs w:val="28"/>
-          <w:lang w:val="de-DE"/>
-        </w:rPr>
-        <w:fldChar w:fldCharType="begin"/>
-      </w:r>
-      <w:r>
-        <w:rPr>
-          <w:rFonts w:ascii="Calibri" w:hAnsi="Calibri" w:cs="Calibri"/>
-          <w:sz w:val="28"/>
-          <w:szCs w:val="28"/>
-          <w:lang w:val="de-DE"/>
-        </w:rPr>
-        <w:instrText>HYPERLINK "https://EH39M31C.ad005.onehc.net:8080"</w:instrText>
-      </w:r>
-      <w:r>
-        <w:rPr>
-          <w:rFonts w:ascii="Calibri" w:hAnsi="Calibri" w:cs="Calibri"/>
-          <w:sz w:val="28"/>
-          <w:szCs w:val="28"/>
-          <w:lang w:val="de-DE"/>
-        </w:rPr>
-      </w:r>
-      <w:r>
-        <w:rPr>
-          <w:rFonts w:ascii="Calibri" w:hAnsi="Calibri" w:cs="Calibri"/>
-          <w:sz w:val="28"/>
-          <w:szCs w:val="28"/>
-          <w:lang w:val="de-DE"/>
-        </w:rPr>
-        <w:fldChar w:fldCharType="separate"/>
-      </w:r>
-      <w:r>
-        <w:rPr>
-          <w:rStyle w:val="Hyperlink"/>
-          <w:rFonts w:ascii="Calibri" w:hAnsi="Calibri" w:cs="Calibri"/>
-          <w:sz w:val="28"/>
-          <w:szCs w:val="28"/>
-          <w:lang w:val="de-DE"/>
-        </w:rPr>
-        <w:t>https://EH39M31C.ad005.onehc.net:8080</w:t>
-      </w:r>
-      <w:r>
-        <w:rPr>
-          <w:rFonts w:ascii="Calibri" w:hAnsi="Calibri" w:cs="Calibri"/>
-          <w:sz w:val="28"/>
-          <w:szCs w:val="28"/>
-          <w:lang w:val="de-DE"/>
-        </w:rPr>
-        <w:fldChar w:fldCharType="end"/>
+          <w:b/>
+          <w:bCs/>
+          <w:color w:val="FF0000"/>
+          <w:sz w:val="28"/>
+          <w:szCs w:val="28"/>
+          <w:lang w:val="de-DE"/>
+        </w:rPr>
+        <w:lastRenderedPageBreak/>
+        <w:t>Einmalig</w:t>
+      </w:r>
+      <w:r>
+        <w:rPr>
+          <w:rFonts w:ascii="Calibri" w:hAnsi="Calibri" w:cs="Calibri"/>
+          <w:sz w:val="28"/>
+          <w:szCs w:val="28"/>
+          <w:lang w:val="de-DE"/>
+        </w:rPr>
+        <w:t>: Sicherheitszertifikat auf Clientmaschine (alle remote clients) installieren für sichere Verbindung.</w:t>
+      </w:r>
+      <w:r>
+        <w:rPr>
+          <w:rFonts w:ascii="Calibri" w:hAnsi="Calibri" w:cs="Calibri"/>
+          <w:sz w:val="28"/>
+          <w:szCs w:val="28"/>
+          <w:lang w:val="de-DE"/>
+        </w:rPr>
+        <w:t xml:space="preserve"> Sonst wird im Browser die WebUI als unsicher gemeldet.</w:t>
       </w:r>
     </w:p>
     <w:p>
       <w:pPr>
+        <w:pStyle w:val="ListParagraph"/>
+        <w:numPr>
+          <w:ilvl w:val="0"/>
+          <w:numId w:val="24"/>
+        </w:numPr>
         <w:spacing w:before="240" w:after="0" w:line="240" w:lineRule="auto"/>
         <w:ind w:right="-425"/>
         <w:jc w:val="both"/>
@@ -1085,6 +1628,433 @@
           <w:rFonts w:ascii="Calibri" w:hAnsi="Calibri" w:cs="Calibri"/>
           <w:sz w:val="28"/>
           <w:szCs w:val="28"/>
+        </w:rPr>
+      </w:pPr>
+      <w:r>
+        <w:rPr>
+          <w:rFonts w:ascii="Calibri" w:hAnsi="Calibri" w:cs="Calibri"/>
+          <w:sz w:val="28"/>
+          <w:szCs w:val="28"/>
+        </w:rPr>
+        <w:t xml:space="preserve">Executable -&gt; Certificates -&gt; intall-mkcert.ps1 </w:t>
+      </w:r>
+      <w:proofErr w:type="spellStart"/>
+      <w:r>
+        <w:rPr>
+          <w:rFonts w:ascii="Calibri" w:hAnsi="Calibri" w:cs="Calibri"/>
+          <w:sz w:val="28"/>
+          <w:szCs w:val="28"/>
+        </w:rPr>
+        <w:t>als</w:t>
+      </w:r>
+      <w:proofErr w:type="spellEnd"/>
+      <w:r>
+        <w:rPr>
+          <w:rFonts w:ascii="Calibri" w:hAnsi="Calibri" w:cs="Calibri"/>
+          <w:sz w:val="28"/>
+          <w:szCs w:val="28"/>
+        </w:rPr>
+        <w:t xml:space="preserve"> Admin </w:t>
+      </w:r>
+      <w:proofErr w:type="spellStart"/>
+      <w:r>
+        <w:rPr>
+          <w:rFonts w:ascii="Calibri" w:hAnsi="Calibri" w:cs="Calibri"/>
+          <w:sz w:val="28"/>
+          <w:szCs w:val="28"/>
+        </w:rPr>
+        <w:t>ausführen</w:t>
+      </w:r>
+      <w:proofErr w:type="spellEnd"/>
+      <w:r>
+        <w:rPr>
+          <w:rFonts w:ascii="Calibri" w:hAnsi="Calibri" w:cs="Calibri"/>
+          <w:sz w:val="28"/>
+          <w:szCs w:val="28"/>
+        </w:rPr>
+        <w:t>.</w:t>
+      </w:r>
+    </w:p>
+    <w:p>
+      <w:pPr>
+        <w:pStyle w:val="ListParagraph"/>
+        <w:numPr>
+          <w:ilvl w:val="0"/>
+          <w:numId w:val="24"/>
+        </w:numPr>
+        <w:spacing w:before="240" w:after="0" w:line="240" w:lineRule="auto"/>
+        <w:ind w:right="-425"/>
+        <w:jc w:val="both"/>
+        <w:rPr>
+          <w:rFonts w:ascii="Calibri" w:hAnsi="Calibri" w:cs="Calibri"/>
+          <w:sz w:val="28"/>
+          <w:szCs w:val="28"/>
+        </w:rPr>
+      </w:pPr>
+      <w:r>
+        <w:rPr>
+          <w:rFonts w:ascii="Calibri" w:hAnsi="Calibri" w:cs="Calibri"/>
+          <w:sz w:val="28"/>
+          <w:szCs w:val="28"/>
+        </w:rPr>
+        <w:t>Executable -&gt; Certificates -&gt;</w:t>
+      </w:r>
+      <w:r>
+        <w:rPr>
+          <w:rFonts w:ascii="Calibri" w:hAnsi="Calibri" w:cs="Calibri"/>
+          <w:sz w:val="28"/>
+          <w:szCs w:val="28"/>
+        </w:rPr>
+        <w:t xml:space="preserve"> rootCertificate</w:t>
+      </w:r>
+      <w:r>
+        <w:rPr>
+          <w:rFonts w:ascii="Calibri" w:hAnsi="Calibri" w:cs="Calibri"/>
+          <w:sz w:val="28"/>
+          <w:szCs w:val="28"/>
+        </w:rPr>
+        <w:t>.crt</w:t>
+      </w:r>
+      <w:r>
+        <w:rPr>
+          <w:rFonts w:ascii="Calibri" w:hAnsi="Calibri" w:cs="Calibri"/>
+          <w:sz w:val="28"/>
+          <w:szCs w:val="28"/>
+        </w:rPr>
+        <w:t xml:space="preserve"> </w:t>
+      </w:r>
+      <w:proofErr w:type="spellStart"/>
+      <w:r>
+        <w:rPr>
+          <w:rFonts w:ascii="Calibri" w:hAnsi="Calibri" w:cs="Calibri"/>
+          <w:sz w:val="28"/>
+          <w:szCs w:val="28"/>
+        </w:rPr>
+        <w:t>öffnen</w:t>
+      </w:r>
+      <w:proofErr w:type="spellEnd"/>
+      <w:r>
+        <w:rPr>
+          <w:rFonts w:ascii="Calibri" w:hAnsi="Calibri" w:cs="Calibri"/>
+          <w:sz w:val="28"/>
+          <w:szCs w:val="28"/>
+        </w:rPr>
+        <w:t xml:space="preserve"> -&gt; install certificate -&gt; current user </w:t>
+      </w:r>
+      <w:r>
+        <w:rPr>
+          <w:rFonts w:ascii="Calibri" w:hAnsi="Calibri" w:cs="Calibri"/>
+          <w:sz w:val="28"/>
+          <w:szCs w:val="28"/>
+        </w:rPr>
+        <w:t>-&gt;</w:t>
+      </w:r>
+      <w:r>
+        <w:rPr>
+          <w:rFonts w:ascii="Calibri" w:hAnsi="Calibri" w:cs="Calibri"/>
+          <w:sz w:val="28"/>
+          <w:szCs w:val="28"/>
+        </w:rPr>
+        <w:t xml:space="preserve"> </w:t>
+      </w:r>
+      <w:r>
+        <w:rPr>
+          <w:rFonts w:ascii="Calibri" w:hAnsi="Calibri" w:cs="Calibri"/>
+          <w:sz w:val="28"/>
+          <w:szCs w:val="28"/>
+        </w:rPr>
+        <w:t>N</w:t>
+      </w:r>
+      <w:r>
+        <w:rPr>
+          <w:rFonts w:ascii="Calibri" w:hAnsi="Calibri" w:cs="Calibri"/>
+          <w:sz w:val="28"/>
+          <w:szCs w:val="28"/>
+        </w:rPr>
+        <w:t xml:space="preserve">ext -&gt; Place all </w:t>
+      </w:r>
+      <w:proofErr w:type="spellStart"/>
+      <w:r>
+        <w:rPr>
+          <w:rFonts w:ascii="Calibri" w:hAnsi="Calibri" w:cs="Calibri"/>
+          <w:sz w:val="28"/>
+          <w:szCs w:val="28"/>
+        </w:rPr>
+        <w:t>certifictaes</w:t>
+      </w:r>
+      <w:proofErr w:type="spellEnd"/>
+      <w:r>
+        <w:rPr>
+          <w:rFonts w:ascii="Calibri" w:hAnsi="Calibri" w:cs="Calibri"/>
+          <w:sz w:val="28"/>
+          <w:szCs w:val="28"/>
+        </w:rPr>
+        <w:t xml:space="preserve"> in the following store -&gt; </w:t>
+      </w:r>
+      <w:r>
+        <w:rPr>
+          <w:rFonts w:ascii="Calibri" w:hAnsi="Calibri" w:cs="Calibri"/>
+          <w:sz w:val="28"/>
+          <w:szCs w:val="28"/>
+        </w:rPr>
+        <w:t>B</w:t>
+      </w:r>
+      <w:r>
+        <w:rPr>
+          <w:rFonts w:ascii="Calibri" w:hAnsi="Calibri" w:cs="Calibri"/>
+          <w:sz w:val="28"/>
+          <w:szCs w:val="28"/>
+        </w:rPr>
+        <w:t xml:space="preserve">rowse </w:t>
+      </w:r>
+      <w:r>
+        <w:rPr>
+          <w:rFonts w:ascii="Calibri" w:hAnsi="Calibri" w:cs="Calibri"/>
+          <w:sz w:val="28"/>
+          <w:szCs w:val="28"/>
+        </w:rPr>
+        <w:t>-&gt;</w:t>
+      </w:r>
+      <w:r>
+        <w:rPr>
+          <w:rFonts w:ascii="Calibri" w:hAnsi="Calibri" w:cs="Calibri"/>
+          <w:sz w:val="28"/>
+          <w:szCs w:val="28"/>
+        </w:rPr>
+        <w:t xml:space="preserve"> “Trusted Root Certification Authorities” </w:t>
+      </w:r>
+      <w:proofErr w:type="spellStart"/>
+      <w:r>
+        <w:rPr>
+          <w:rFonts w:ascii="Calibri" w:hAnsi="Calibri" w:cs="Calibri"/>
+          <w:sz w:val="28"/>
+          <w:szCs w:val="28"/>
+        </w:rPr>
+        <w:t>auswählen</w:t>
+      </w:r>
+      <w:proofErr w:type="spellEnd"/>
+      <w:r>
+        <w:rPr>
+          <w:rFonts w:ascii="Calibri" w:hAnsi="Calibri" w:cs="Calibri"/>
+          <w:sz w:val="28"/>
+          <w:szCs w:val="28"/>
+        </w:rPr>
+        <w:t xml:space="preserve"> und auf OK </w:t>
+      </w:r>
+      <w:proofErr w:type="spellStart"/>
+      <w:r>
+        <w:rPr>
+          <w:rFonts w:ascii="Calibri" w:hAnsi="Calibri" w:cs="Calibri"/>
+          <w:sz w:val="28"/>
+          <w:szCs w:val="28"/>
+        </w:rPr>
+        <w:t>klicken</w:t>
+      </w:r>
+      <w:proofErr w:type="spellEnd"/>
+      <w:r>
+        <w:rPr>
+          <w:rFonts w:ascii="Calibri" w:hAnsi="Calibri" w:cs="Calibri"/>
+          <w:sz w:val="28"/>
+          <w:szCs w:val="28"/>
+        </w:rPr>
+        <w:t xml:space="preserve"> -&gt; Next </w:t>
+      </w:r>
+      <w:r>
+        <w:rPr>
+          <w:rFonts w:ascii="Calibri" w:hAnsi="Calibri" w:cs="Calibri"/>
+          <w:sz w:val="28"/>
+          <w:szCs w:val="28"/>
+        </w:rPr>
+        <w:t>-&gt;</w:t>
+      </w:r>
+      <w:r>
+        <w:rPr>
+          <w:rFonts w:ascii="Calibri" w:hAnsi="Calibri" w:cs="Calibri"/>
+          <w:sz w:val="28"/>
+          <w:szCs w:val="28"/>
+        </w:rPr>
+        <w:t xml:space="preserve"> Finish</w:t>
+      </w:r>
+    </w:p>
+    <w:p>
+      <w:pPr>
+        <w:pStyle w:val="ListParagraph"/>
+        <w:spacing w:before="240" w:after="0" w:line="240" w:lineRule="auto"/>
+        <w:ind w:left="430" w:right="-425"/>
+        <w:jc w:val="center"/>
+        <w:rPr>
+          <w:rFonts w:ascii="Calibri" w:hAnsi="Calibri" w:cs="Calibri"/>
+          <w:sz w:val="28"/>
+          <w:szCs w:val="28"/>
+        </w:rPr>
+      </w:pPr>
+    </w:p>
+    <w:p>
+      <w:pPr>
+        <w:pStyle w:val="ListParagraph"/>
+        <w:spacing w:before="240" w:after="0" w:line="240" w:lineRule="auto"/>
+        <w:ind w:left="430" w:right="-425"/>
+        <w:jc w:val="center"/>
+        <w:rPr>
+          <w:rFonts w:ascii="Calibri" w:hAnsi="Calibri" w:cs="Calibri"/>
+          <w:sz w:val="28"/>
+          <w:szCs w:val="28"/>
+        </w:rPr>
+      </w:pPr>
+    </w:p>
+    <w:p>
+      <w:pPr>
+        <w:pStyle w:val="ListParagraph"/>
+        <w:numPr>
+          <w:ilvl w:val="0"/>
+          <w:numId w:val="12"/>
+        </w:numPr>
+        <w:spacing w:before="240" w:after="0" w:line="240" w:lineRule="auto"/>
+        <w:ind w:right="-425"/>
+        <w:jc w:val="both"/>
+        <w:rPr>
+          <w:rFonts w:ascii="Calibri" w:hAnsi="Calibri" w:cs="Calibri"/>
+          <w:sz w:val="28"/>
+          <w:szCs w:val="28"/>
+          <w:lang w:val="de-DE"/>
+        </w:rPr>
+      </w:pPr>
+      <w:r>
+        <w:rPr>
+          <w:rFonts w:ascii="Calibri" w:hAnsi="Calibri" w:cs="Calibri"/>
+          <w:sz w:val="28"/>
+          <w:szCs w:val="28"/>
+          <w:lang w:val="de-DE"/>
+        </w:rPr>
+        <w:t>Web UI i</w:t>
+      </w:r>
+      <w:r>
+        <w:rPr>
+          <w:rFonts w:ascii="Calibri" w:hAnsi="Calibri" w:cs="Calibri"/>
+          <w:sz w:val="28"/>
+          <w:szCs w:val="28"/>
+          <w:lang w:val="de-DE"/>
+        </w:rPr>
+        <w:t>m Browser öffnen</w:t>
+      </w:r>
+      <w:r>
+        <w:rPr>
+          <w:rFonts w:ascii="Calibri" w:hAnsi="Calibri" w:cs="Calibri"/>
+          <w:sz w:val="28"/>
+          <w:szCs w:val="28"/>
+          <w:lang w:val="de-DE"/>
+        </w:rPr>
+        <w:t xml:space="preserve">: </w:t>
+      </w:r>
+      <w:r>
+        <w:rPr>
+          <w:rFonts w:ascii="Calibri" w:hAnsi="Calibri" w:cs="Calibri"/>
+          <w:sz w:val="28"/>
+          <w:szCs w:val="28"/>
+          <w:lang w:val="de-DE"/>
+        </w:rPr>
+        <w:t>https://</w:t>
+      </w:r>
+      <w:r>
+        <w:rPr>
+          <w:rFonts w:ascii="Calibri" w:hAnsi="Calibri" w:cs="Calibri"/>
+          <w:sz w:val="28"/>
+          <w:szCs w:val="28"/>
+          <w:lang w:val="de-DE"/>
+        </w:rPr>
+        <w:t>&lt;Server&gt;</w:t>
+      </w:r>
+      <w:r>
+        <w:rPr>
+          <w:rFonts w:ascii="Calibri" w:hAnsi="Calibri" w:cs="Calibri"/>
+          <w:sz w:val="28"/>
+          <w:szCs w:val="28"/>
+          <w:lang w:val="de-DE"/>
+        </w:rPr>
+        <w:t>.ad005.onehc.net</w:t>
+      </w:r>
+      <w:r>
+        <w:rPr>
+          <w:rFonts w:ascii="Calibri" w:hAnsi="Calibri" w:cs="Calibri"/>
+          <w:sz w:val="28"/>
+          <w:szCs w:val="28"/>
+          <w:lang w:val="de-DE"/>
+        </w:rPr>
+        <w:t>:</w:t>
+      </w:r>
+      <w:r>
+        <w:rPr>
+          <w:rFonts w:ascii="Calibri" w:hAnsi="Calibri" w:cs="Calibri"/>
+          <w:sz w:val="28"/>
+          <w:szCs w:val="28"/>
+          <w:lang w:val="de-DE"/>
+        </w:rPr>
+        <w:t xml:space="preserve">8080 --&gt;z.B.: </w:t>
+      </w:r>
+      <w:r>
+        <w:rPr>
+          <w:rFonts w:ascii="Calibri" w:hAnsi="Calibri" w:cs="Calibri"/>
+          <w:sz w:val="28"/>
+          <w:szCs w:val="28"/>
+          <w:lang w:val="de-DE"/>
+        </w:rPr>
+        <w:fldChar w:fldCharType="begin"/>
+      </w:r>
+      <w:r>
+        <w:rPr>
+          <w:rFonts w:ascii="Calibri" w:hAnsi="Calibri" w:cs="Calibri"/>
+          <w:sz w:val="28"/>
+          <w:szCs w:val="28"/>
+          <w:lang w:val="de-DE"/>
+        </w:rPr>
+        <w:instrText>HYPERLINK "https://EH39M31C.ad005.onehc.net:8080"</w:instrText>
+      </w:r>
+      <w:r>
+        <w:rPr>
+          <w:rFonts w:ascii="Calibri" w:hAnsi="Calibri" w:cs="Calibri"/>
+          <w:sz w:val="28"/>
+          <w:szCs w:val="28"/>
+          <w:lang w:val="de-DE"/>
+        </w:rPr>
+      </w:r>
+      <w:r>
+        <w:rPr>
+          <w:rFonts w:ascii="Calibri" w:hAnsi="Calibri" w:cs="Calibri"/>
+          <w:sz w:val="28"/>
+          <w:szCs w:val="28"/>
+          <w:lang w:val="de-DE"/>
+        </w:rPr>
+        <w:fldChar w:fldCharType="separate"/>
+      </w:r>
+      <w:r>
+        <w:rPr>
+          <w:rStyle w:val="Hyperlink"/>
+          <w:rFonts w:ascii="Calibri" w:hAnsi="Calibri" w:cs="Calibri"/>
+          <w:sz w:val="28"/>
+          <w:szCs w:val="28"/>
+          <w:lang w:val="de-DE"/>
+        </w:rPr>
+        <w:t>https://EH39M31C.ad005.onehc.net:8080</w:t>
+      </w:r>
+      <w:r>
+        <w:rPr>
+          <w:rFonts w:ascii="Calibri" w:hAnsi="Calibri" w:cs="Calibri"/>
+          <w:sz w:val="28"/>
+          <w:szCs w:val="28"/>
+          <w:lang w:val="de-DE"/>
+        </w:rPr>
+        <w:fldChar w:fldCharType="end"/>
+      </w:r>
+    </w:p>
+    <w:p>
+      <w:pPr>
+        <w:spacing w:before="240" w:after="0" w:line="240" w:lineRule="auto"/>
+        <w:ind w:right="-425"/>
+        <w:jc w:val="both"/>
+        <w:rPr>
+          <w:rFonts w:ascii="Calibri" w:hAnsi="Calibri" w:cs="Calibri"/>
+          <w:sz w:val="28"/>
+          <w:szCs w:val="28"/>
           <w:lang w:val="de-DE"/>
         </w:rPr>
       </w:pPr>
@@ -1097,13 +2067,13 @@
           <w:lang w:val="de-DE"/>
         </w:rPr>
         <w:drawing>
-          <wp:anchor distT="0" distB="0" distL="114300" distR="114300" simplePos="0" relativeHeight="251660288" behindDoc="0" locked="0" layoutInCell="1" allowOverlap="1" wp14:anchorId="37B8B866" wp14:editId="35D32E68">
+          <wp:anchor distT="0" distB="0" distL="114300" distR="114300" simplePos="0" relativeHeight="251660288" behindDoc="0" locked="0" layoutInCell="1" allowOverlap="1" wp14:anchorId="37B8B866" wp14:editId="3ADFDC33">
             <wp:simplePos x="0" y="0"/>
             <wp:positionH relativeFrom="page">
               <wp:align>center</wp:align>
             </wp:positionH>
             <wp:positionV relativeFrom="paragraph">
-              <wp:posOffset>31750</wp:posOffset>
+              <wp:posOffset>-1067</wp:posOffset>
             </wp:positionV>
             <wp:extent cx="7150100" cy="1490544"/>
             <wp:effectExtent l="0" t="0" r="0" b="0"/>
@@ -1333,7 +2303,7 @@
         <w:pStyle w:val="ListParagraph"/>
         <w:numPr>
           <w:ilvl w:val="0"/>
-          <w:numId w:val="13"/>
+          <w:numId w:val="12"/>
         </w:numPr>
         <w:spacing w:before="240" w:after="0" w:line="240" w:lineRule="auto"/>
         <w:ind w:right="-425"/>
@@ -1355,7 +2325,6 @@
           <w:szCs w:val="28"/>
           <w:lang w:val="de-DE"/>
         </w:rPr>
-        <w:lastRenderedPageBreak/>
         <w:t>Beschreibung der Web UI</w:t>
       </w:r>
     </w:p>
@@ -1441,7 +2410,21 @@
                                 <w:color w:val="FF0000"/>
                                 <w:lang w:val="de-DE"/>
                               </w:rPr>
-                              <w:t>Serverinformationen sowie Anzahl der angeschlossenen G</w:t>
+                              <w:t xml:space="preserve">Serverinformationen </w:t>
+                            </w:r>
+                            <w:r>
+                              <w:rPr>
+                                <w:color w:val="FF0000"/>
+                                <w:lang w:val="de-DE"/>
+                              </w:rPr>
+                              <w:t>mit</w:t>
+                            </w:r>
+                            <w:r>
+                              <w:rPr>
+                                <w:color w:val="FF0000"/>
+                                <w:lang w:val="de-DE"/>
+                              </w:rPr>
+                              <w:t xml:space="preserve"> Anzahl der angeschlossenen G</w:t>
                             </w:r>
                             <w:r>
                               <w:rPr>
@@ -1485,7 +2468,21 @@
                           <w:color w:val="FF0000"/>
                           <w:lang w:val="de-DE"/>
                         </w:rPr>
-                        <w:t>Serverinformationen sowie Anzahl der angeschlossenen G</w:t>
+                        <w:t xml:space="preserve">Serverinformationen </w:t>
+                      </w:r>
+                      <w:r>
+                        <w:rPr>
+                          <w:color w:val="FF0000"/>
+                          <w:lang w:val="de-DE"/>
+                        </w:rPr>
+                        <w:t>mit</w:t>
+                      </w:r>
+                      <w:r>
+                        <w:rPr>
+                          <w:color w:val="FF0000"/>
+                          <w:lang w:val="de-DE"/>
+                        </w:rPr>
+                        <w:t xml:space="preserve"> Anzahl der angeschlossenen G</w:t>
                       </w:r>
                       <w:r>
                         <w:rPr>
@@ -1788,7 +2785,7 @@
           <w:lang w:val="de-DE"/>
         </w:rPr>
         <w:drawing>
-          <wp:anchor distT="0" distB="0" distL="114300" distR="114300" simplePos="0" relativeHeight="251662336" behindDoc="0" locked="0" layoutInCell="1" allowOverlap="1" wp14:anchorId="57A8EAEF" wp14:editId="3E8B6C2E">
+          <wp:anchor distT="0" distB="0" distL="114300" distR="114300" simplePos="0" relativeHeight="251662336" behindDoc="0" locked="0" layoutInCell="1" allowOverlap="1" wp14:anchorId="57A8EAEF" wp14:editId="09EE5A43">
             <wp:simplePos x="0" y="0"/>
             <wp:positionH relativeFrom="margin">
               <wp:posOffset>354965</wp:posOffset>
@@ -2947,109 +3944,6 @@
           <w:lang w:val="de-DE"/>
         </w:rPr>
       </w:pPr>
-    </w:p>
-    <w:p>
-      <w:pPr>
-        <w:spacing w:before="240" w:after="0" w:line="240" w:lineRule="auto"/>
-        <w:ind w:left="70" w:right="-425"/>
-        <w:jc w:val="center"/>
-        <w:rPr>
-          <w:rFonts w:ascii="Calibri" w:hAnsi="Calibri" w:cs="Calibri"/>
-          <w:b/>
-          <w:bCs/>
-          <w:sz w:val="28"/>
-          <w:szCs w:val="28"/>
-          <w:lang w:val="de-DE"/>
-        </w:rPr>
-      </w:pPr>
-    </w:p>
-    <w:p>
-      <w:pPr>
-        <w:spacing w:before="240" w:after="0" w:line="240" w:lineRule="auto"/>
-        <w:ind w:left="70" w:right="-425"/>
-        <w:jc w:val="center"/>
-        <w:rPr>
-          <w:rFonts w:ascii="Calibri" w:hAnsi="Calibri" w:cs="Calibri"/>
-          <w:b/>
-          <w:bCs/>
-          <w:sz w:val="28"/>
-          <w:szCs w:val="28"/>
-          <w:lang w:val="de-DE"/>
-        </w:rPr>
-      </w:pPr>
-      <w:r>
-        <w:rPr>
-          <w:rFonts w:ascii="Calibri" w:hAnsi="Calibri" w:cs="Calibri"/>
-          <w:noProof/>
-          <w:sz w:val="28"/>
-          <w:szCs w:val="28"/>
-          <w:lang w:val="de-DE"/>
-        </w:rPr>
-        <w:drawing>
-          <wp:anchor distT="0" distB="0" distL="114300" distR="114300" simplePos="0" relativeHeight="251683840" behindDoc="0" locked="0" layoutInCell="1" allowOverlap="1" wp14:anchorId="447306DB" wp14:editId="1029585A">
-            <wp:simplePos x="0" y="0"/>
-            <wp:positionH relativeFrom="page">
-              <wp:posOffset>748665</wp:posOffset>
-            </wp:positionH>
-            <wp:positionV relativeFrom="paragraph">
-              <wp:posOffset>106363</wp:posOffset>
-            </wp:positionV>
-            <wp:extent cx="1770279" cy="1179714"/>
-            <wp:effectExtent l="0" t="0" r="1905" b="1905"/>
-            <wp:wrapNone/>
-            <wp:docPr id="1426814840" name="Picture 1"/>
-            <wp:cNvGraphicFramePr>
-              <a:graphicFrameLocks xmlns:a="http://schemas.openxmlformats.org/drawingml/2006/main" noChangeAspect="1"/>
-            </wp:cNvGraphicFramePr>
-            <a:graphic xmlns:a="http://schemas.openxmlformats.org/drawingml/2006/main">
-              <a:graphicData uri="http://schemas.openxmlformats.org/drawingml/2006/picture">
-                <pic:pic xmlns:pic="http://schemas.openxmlformats.org/drawingml/2006/picture">
-                  <pic:nvPicPr>
-                    <pic:cNvPr id="1139395841" name=""/>
-                    <pic:cNvPicPr/>
-                  </pic:nvPicPr>
-                  <pic:blipFill rotWithShape="1">
-                    <a:blip r:embed="rId13" cstate="print">
-                      <a:extLst>
-                        <a:ext uri="{28A0092B-C50C-407E-A947-70E740481C1C}">
-                          <a14:useLocalDpi xmlns:a14="http://schemas.microsoft.com/office/drawing/2010/main" val="0"/>
-                        </a:ext>
-                      </a:extLst>
-                    </a:blip>
-                    <a:srcRect l="73418" t="23296" r="2588"/>
-                    <a:stretch>
-                      <a:fillRect/>
-                    </a:stretch>
-                  </pic:blipFill>
-                  <pic:spPr bwMode="auto">
-                    <a:xfrm>
-                      <a:off x="0" y="0"/>
-                      <a:ext cx="1770279" cy="1179714"/>
-                    </a:xfrm>
-                    <a:prstGeom prst="rect">
-                      <a:avLst/>
-                    </a:prstGeom>
-                    <a:ln>
-                      <a:noFill/>
-                    </a:ln>
-                    <a:extLst>
-                      <a:ext uri="{53640926-AAD7-44D8-BBD7-CCE9431645EC}">
-                        <a14:shadowObscured xmlns:a14="http://schemas.microsoft.com/office/drawing/2010/main"/>
-                      </a:ext>
-                    </a:extLst>
-                  </pic:spPr>
-                </pic:pic>
-              </a:graphicData>
-            </a:graphic>
-            <wp14:sizeRelH relativeFrom="margin">
-              <wp14:pctWidth>0</wp14:pctWidth>
-            </wp14:sizeRelH>
-            <wp14:sizeRelV relativeFrom="margin">
-              <wp14:pctHeight>0</wp14:pctHeight>
-            </wp14:sizeRelV>
-          </wp:anchor>
-        </w:drawing>
-      </w:r>
       <w:r>
         <w:rPr>
           <w:rFonts w:ascii="Calibri" w:hAnsi="Calibri" w:cs="Calibri"/>
@@ -3063,13 +3957,13 @@
         <mc:AlternateContent>
           <mc:Choice Requires="wps">
             <w:drawing>
-              <wp:anchor distT="0" distB="0" distL="114300" distR="114300" simplePos="0" relativeHeight="251685888" behindDoc="0" locked="0" layoutInCell="1" allowOverlap="1" wp14:anchorId="385B7FF9" wp14:editId="2C2EC933">
+              <wp:anchor distT="0" distB="0" distL="114300" distR="114300" simplePos="0" relativeHeight="251685888" behindDoc="0" locked="0" layoutInCell="1" allowOverlap="1" wp14:anchorId="385B7FF9" wp14:editId="4A2F2301">
                 <wp:simplePos x="0" y="0"/>
                 <wp:positionH relativeFrom="column">
-                  <wp:posOffset>-5080</wp:posOffset>
+                  <wp:posOffset>24130</wp:posOffset>
                 </wp:positionH>
                 <wp:positionV relativeFrom="paragraph">
-                  <wp:posOffset>50800</wp:posOffset>
+                  <wp:posOffset>158191</wp:posOffset>
                 </wp:positionV>
                 <wp:extent cx="1835785" cy="1308735"/>
                 <wp:effectExtent l="0" t="0" r="697865" b="24765"/>
@@ -3147,7 +4041,7 @@
           </mc:Choice>
           <mc:Fallback>
             <w:pict>
-              <v:shape w14:anchorId="385B7FF9" id="_x0000_s1038" type="#_x0000_t48" style="position:absolute;left:0;text-align:left;margin-left:-.4pt;margin-top:4pt;width:144.55pt;height:103.05pt;z-index:251685888;visibility:visible;mso-wrap-style:square;mso-width-percent:0;mso-height-percent:0;mso-wrap-distance-left:9pt;mso-wrap-distance-top:0;mso-wrap-distance-right:9pt;mso-wrap-distance-bottom:0;mso-position-horizontal:absolute;mso-position-horizontal-relative:text;mso-position-vertical:absolute;mso-position-vertical-relative:text;mso-width-percent:0;mso-height-percent:0;mso-width-relative:margin;mso-height-relative:margin;v-text-anchor:middle" o:gfxdata="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" adj="29666,18127,29674,10502,21607,10346" filled="f" strokecolor="red" strokeweight="2pt">
+              <v:shape w14:anchorId="385B7FF9" id="_x0000_s1038" type="#_x0000_t48" style="position:absolute;left:0;text-align:left;margin-left:1.9pt;margin-top:12.45pt;width:144.55pt;height:103.05pt;z-index:251685888;visibility:visible;mso-wrap-style:square;mso-width-percent:0;mso-height-percent:0;mso-wrap-distance-left:9pt;mso-wrap-distance-top:0;mso-wrap-distance-right:9pt;mso-wrap-distance-bottom:0;mso-position-horizontal:absolute;mso-position-horizontal-relative:text;mso-position-vertical:absolute;mso-position-vertical-relative:text;mso-width-percent:0;mso-height-percent:0;mso-width-relative:margin;mso-height-relative:margin;v-text-anchor:middle" o:gfxdata="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" adj="29666,18127,29674,10502,21607,10346" filled="f" strokecolor="red" strokeweight="2pt">
                 <v:textbox>
                   <w:txbxContent>
                     <w:p>
@@ -3163,6 +4057,79 @@
           </mc:Fallback>
         </mc:AlternateContent>
       </w:r>
+      <w:r>
+        <w:rPr>
+          <w:rFonts w:ascii="Calibri" w:hAnsi="Calibri" w:cs="Calibri"/>
+          <w:noProof/>
+          <w:sz w:val="28"/>
+          <w:szCs w:val="28"/>
+          <w:lang w:val="de-DE"/>
+        </w:rPr>
+        <w:drawing>
+          <wp:anchor distT="0" distB="0" distL="114300" distR="114300" simplePos="0" relativeHeight="251683840" behindDoc="0" locked="0" layoutInCell="1" allowOverlap="1" wp14:anchorId="447306DB" wp14:editId="12FCFF05">
+            <wp:simplePos x="0" y="0"/>
+            <wp:positionH relativeFrom="page">
+              <wp:posOffset>777926</wp:posOffset>
+            </wp:positionH>
+            <wp:positionV relativeFrom="paragraph">
+              <wp:posOffset>245339</wp:posOffset>
+            </wp:positionV>
+            <wp:extent cx="1770279" cy="1179714"/>
+            <wp:effectExtent l="0" t="0" r="1905" b="1905"/>
+            <wp:wrapNone/>
+            <wp:docPr id="1426814840" name="Picture 1"/>
+            <wp:cNvGraphicFramePr>
+              <a:graphicFrameLocks xmlns:a="http://schemas.openxmlformats.org/drawingml/2006/main" noChangeAspect="1"/>
+            </wp:cNvGraphicFramePr>
+            <a:graphic xmlns:a="http://schemas.openxmlformats.org/drawingml/2006/main">
+              <a:graphicData uri="http://schemas.openxmlformats.org/drawingml/2006/picture">
+                <pic:pic xmlns:pic="http://schemas.openxmlformats.org/drawingml/2006/picture">
+                  <pic:nvPicPr>
+                    <pic:cNvPr id="1139395841" name=""/>
+                    <pic:cNvPicPr/>
+                  </pic:nvPicPr>
+                  <pic:blipFill rotWithShape="1">
+                    <a:blip r:embed="rId13" cstate="print">
+                      <a:extLst>
+                        <a:ext uri="{28A0092B-C50C-407E-A947-70E740481C1C}">
+                          <a14:useLocalDpi xmlns:a14="http://schemas.microsoft.com/office/drawing/2010/main" val="0"/>
+                        </a:ext>
+                      </a:extLst>
+                    </a:blip>
+                    <a:srcRect l="73418" t="23296" r="2588"/>
+                    <a:stretch>
+                      <a:fillRect/>
+                    </a:stretch>
+                  </pic:blipFill>
+                  <pic:spPr bwMode="auto">
+                    <a:xfrm>
+                      <a:off x="0" y="0"/>
+                      <a:ext cx="1770279" cy="1179714"/>
+                    </a:xfrm>
+                    <a:prstGeom prst="rect">
+                      <a:avLst/>
+                    </a:prstGeom>
+                    <a:ln>
+                      <a:noFill/>
+                    </a:ln>
+                    <a:extLst>
+                      <a:ext uri="{53640926-AAD7-44D8-BBD7-CCE9431645EC}">
+                        <a14:shadowObscured xmlns:a14="http://schemas.microsoft.com/office/drawing/2010/main"/>
+                      </a:ext>
+                    </a:extLst>
+                  </pic:spPr>
+                </pic:pic>
+              </a:graphicData>
+            </a:graphic>
+            <wp14:sizeRelH relativeFrom="margin">
+              <wp14:pctWidth>0</wp14:pctWidth>
+            </wp14:sizeRelH>
+            <wp14:sizeRelV relativeFrom="margin">
+              <wp14:pctHeight>0</wp14:pctHeight>
+            </wp14:sizeRelV>
+          </wp:anchor>
+        </w:drawing>
+      </w:r>
     </w:p>
     <w:p>
       <w:pPr>
@@ -3206,13 +4173,13 @@
         <mc:AlternateContent>
           <mc:Choice Requires="wps">
             <w:drawing>
-              <wp:anchor distT="45720" distB="45720" distL="114300" distR="114300" simplePos="0" relativeHeight="251687936" behindDoc="0" locked="0" layoutInCell="1" allowOverlap="1" wp14:anchorId="3118B53A" wp14:editId="28FCB7A6">
+              <wp:anchor distT="45720" distB="45720" distL="114300" distR="114300" simplePos="0" relativeHeight="251687936" behindDoc="0" locked="0" layoutInCell="1" allowOverlap="1" wp14:anchorId="3118B53A" wp14:editId="4EDC0E6C">
                 <wp:simplePos x="0" y="0"/>
-                <wp:positionH relativeFrom="page">
-                  <wp:posOffset>2834640</wp:posOffset>
+                <wp:positionH relativeFrom="margin">
+                  <wp:align>center</wp:align>
                 </wp:positionH>
                 <wp:positionV relativeFrom="paragraph">
-                  <wp:posOffset>232092</wp:posOffset>
+                  <wp:posOffset>-168275</wp:posOffset>
                 </wp:positionV>
                 <wp:extent cx="1866900" cy="853440"/>
                 <wp:effectExtent l="0" t="0" r="19050" b="22860"/>
@@ -3278,14 +4245,7 @@
                                 <w:color w:val="FF0000"/>
                                 <w:lang w:val="de-DE"/>
                               </w:rPr>
-                              <w:t xml:space="preserve">Listet </w:t>
-                            </w:r>
-                            <w:r>
-                              <w:rPr>
-                                <w:color w:val="FF0000"/>
-                                <w:lang w:val="de-DE"/>
-                              </w:rPr>
-                              <w:t>alle Erignisse und Aktionen</w:t>
+                              <w:t>Listet alle Erignisse und Aktionen</w:t>
                             </w:r>
                             <w:r>
                               <w:rPr>
@@ -3335,7 +4295,7 @@
           </mc:Choice>
           <mc:Fallback>
             <w:pict>
-              <v:shape w14:anchorId="3118B53A" id="_x0000_s1039" type="#_x0000_t202" style="position:absolute;left:0;text-align:left;margin-left:223.2pt;margin-top:18.25pt;width:147pt;height:67.2pt;z-index:251687936;visibility:visible;mso-wrap-style:square;mso-width-percent:0;mso-height-percent:0;mso-wrap-distance-left:9pt;mso-wrap-distance-top:3.6pt;mso-wrap-distance-right:9pt;mso-wrap-distance-bottom:3.6pt;mso-position-horizontal:absolute;mso-position-horizontal-relative:page;mso-position-vertical:absolute;mso-position-vertical-relative:text;mso-width-percent:0;mso-height-percent:0;mso-width-relative:margin;mso-height-relative:margin;v-text-anchor:top" o:gfxdata="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">
+              <v:shape w14:anchorId="3118B53A" id="_x0000_s1039" type="#_x0000_t202" style="position:absolute;left:0;text-align:left;margin-left:0;margin-top:-13.25pt;width:147pt;height:67.2pt;z-index:251687936;visibility:visible;mso-wrap-style:square;mso-width-percent:0;mso-height-percent:0;mso-wrap-distance-left:9pt;mso-wrap-distance-top:3.6pt;mso-wrap-distance-right:9pt;mso-wrap-distance-bottom:3.6pt;mso-position-horizontal:center;mso-position-horizontal-relative:margin;mso-position-vertical:absolute;mso-position-vertical-relative:text;mso-width-percent:0;mso-height-percent:0;mso-width-relative:margin;mso-height-relative:margin;v-text-anchor:top" o:gfxdata="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">
                 <v:textbox>
                   <w:txbxContent>
                     <w:p>
@@ -3367,14 +4327,7 @@
                           <w:color w:val="FF0000"/>
                           <w:lang w:val="de-DE"/>
                         </w:rPr>
-                        <w:t xml:space="preserve">Listet </w:t>
-                      </w:r>
-                      <w:r>
-                        <w:rPr>
-                          <w:color w:val="FF0000"/>
-                          <w:lang w:val="de-DE"/>
-                        </w:rPr>
-                        <w:t>alle Erignisse und Aktionen</w:t>
+                        <w:t>Listet alle Erignisse und Aktionen</w:t>
                       </w:r>
                       <w:r>
                         <w:rPr>
@@ -3407,7 +4360,7 @@
                     </w:p>
                   </w:txbxContent>
                 </v:textbox>
-                <w10:wrap type="square" anchorx="page"/>
+                <w10:wrap type="square" anchorx="margin"/>
               </v:shape>
             </w:pict>
           </mc:Fallback>
@@ -3416,151 +4369,10 @@
     </w:p>
     <w:p>
       <w:pPr>
-        <w:spacing w:before="240" w:after="0" w:line="240" w:lineRule="auto"/>
-        <w:ind w:left="70" w:right="-425"/>
-        <w:jc w:val="center"/>
-        <w:rPr>
-          <w:rFonts w:ascii="Calibri" w:hAnsi="Calibri" w:cs="Calibri"/>
-          <w:b/>
-          <w:bCs/>
-          <w:sz w:val="28"/>
-          <w:szCs w:val="28"/>
-          <w:lang w:val="de-DE"/>
-        </w:rPr>
-      </w:pPr>
-    </w:p>
-    <w:p>
-      <w:pPr>
-        <w:spacing w:before="240" w:after="0" w:line="240" w:lineRule="auto"/>
-        <w:ind w:right="-425"/>
-        <w:rPr>
-          <w:rFonts w:ascii="Calibri" w:hAnsi="Calibri" w:cs="Calibri"/>
-          <w:b/>
-          <w:bCs/>
-          <w:sz w:val="28"/>
-          <w:szCs w:val="28"/>
-          <w:lang w:val="de-DE"/>
-        </w:rPr>
-      </w:pPr>
-    </w:p>
-    <w:p>
-      <w:pPr>
-        <w:spacing w:before="240" w:after="0" w:line="240" w:lineRule="auto"/>
-        <w:ind w:right="-425"/>
-        <w:rPr>
-          <w:rFonts w:ascii="Calibri" w:hAnsi="Calibri" w:cs="Calibri"/>
-          <w:b/>
-          <w:bCs/>
-          <w:sz w:val="28"/>
-          <w:szCs w:val="28"/>
-          <w:lang w:val="de-DE"/>
-        </w:rPr>
-      </w:pPr>
-    </w:p>
-    <w:p>
-      <w:pPr>
-        <w:spacing w:before="240" w:after="0" w:line="240" w:lineRule="auto"/>
-        <w:ind w:right="-425"/>
-        <w:rPr>
-          <w:rFonts w:ascii="Calibri" w:hAnsi="Calibri" w:cs="Calibri"/>
-          <w:b/>
-          <w:bCs/>
-          <w:sz w:val="28"/>
-          <w:szCs w:val="28"/>
-          <w:lang w:val="de-DE"/>
-        </w:rPr>
-      </w:pPr>
-    </w:p>
-    <w:p>
-      <w:pPr>
-        <w:spacing w:before="240" w:after="0" w:line="240" w:lineRule="auto"/>
-        <w:ind w:right="-425"/>
-        <w:rPr>
-          <w:rFonts w:ascii="Calibri" w:hAnsi="Calibri" w:cs="Calibri"/>
-          <w:b/>
-          <w:bCs/>
-          <w:sz w:val="28"/>
-          <w:szCs w:val="28"/>
-          <w:lang w:val="de-DE"/>
-        </w:rPr>
-      </w:pPr>
-    </w:p>
-    <w:p>
-      <w:pPr>
-        <w:spacing w:before="240" w:after="0" w:line="240" w:lineRule="auto"/>
-        <w:ind w:right="-425"/>
-        <w:rPr>
-          <w:rFonts w:ascii="Calibri" w:hAnsi="Calibri" w:cs="Calibri"/>
-          <w:b/>
-          <w:bCs/>
-          <w:sz w:val="28"/>
-          <w:szCs w:val="28"/>
-          <w:lang w:val="de-DE"/>
-        </w:rPr>
-      </w:pPr>
-    </w:p>
-    <w:p>
-      <w:pPr>
-        <w:spacing w:before="240" w:after="0" w:line="240" w:lineRule="auto"/>
-        <w:ind w:right="-425"/>
-        <w:rPr>
-          <w:rFonts w:ascii="Calibri" w:hAnsi="Calibri" w:cs="Calibri"/>
-          <w:b/>
-          <w:bCs/>
-          <w:sz w:val="28"/>
-          <w:szCs w:val="28"/>
-          <w:lang w:val="de-DE"/>
-        </w:rPr>
-      </w:pPr>
-    </w:p>
-    <w:p>
-      <w:pPr>
-        <w:spacing w:before="240" w:after="0" w:line="240" w:lineRule="auto"/>
-        <w:ind w:right="-425"/>
-        <w:rPr>
-          <w:rFonts w:ascii="Calibri" w:hAnsi="Calibri" w:cs="Calibri"/>
-          <w:b/>
-          <w:bCs/>
-          <w:sz w:val="28"/>
-          <w:szCs w:val="28"/>
-          <w:lang w:val="de-DE"/>
-        </w:rPr>
-      </w:pPr>
-    </w:p>
-    <w:p>
-      <w:pPr>
-        <w:spacing w:before="240" w:after="0" w:line="240" w:lineRule="auto"/>
-        <w:ind w:right="-425"/>
-        <w:rPr>
-          <w:rFonts w:ascii="Calibri" w:hAnsi="Calibri" w:cs="Calibri"/>
-          <w:b/>
-          <w:bCs/>
-          <w:sz w:val="28"/>
-          <w:szCs w:val="28"/>
-          <w:lang w:val="de-DE"/>
-        </w:rPr>
-      </w:pPr>
-    </w:p>
-    <w:p>
-      <w:pPr>
-        <w:spacing w:before="240" w:after="0" w:line="240" w:lineRule="auto"/>
-        <w:ind w:right="-425"/>
-        <w:rPr>
-          <w:rFonts w:ascii="Calibri" w:hAnsi="Calibri" w:cs="Calibri"/>
-          <w:b/>
-          <w:bCs/>
-          <w:sz w:val="28"/>
-          <w:szCs w:val="28"/>
-          <w:lang w:val="de-DE"/>
-        </w:rPr>
-      </w:pPr>
-    </w:p>
-    <w:p>
-      <w:pPr>
         <w:pStyle w:val="ListParagraph"/>
         <w:numPr>
           <w:ilvl w:val="0"/>
-          <w:numId w:val="13"/>
+          <w:numId w:val="12"/>
         </w:numPr>
         <w:spacing w:before="240" w:after="0" w:line="240" w:lineRule="auto"/>
         <w:ind w:right="-425"/>
@@ -3595,7 +4407,29 @@
           <w:szCs w:val="28"/>
           <w:lang w:val="de-DE"/>
         </w:rPr>
-        <w:t>HTTPS/SSL Zertifikat generieren (falls abgelaufen):</w:t>
+        <w:t xml:space="preserve">HTTPS/SSL Zertifikat </w:t>
+      </w:r>
+      <w:r>
+        <w:rPr>
+          <w:rFonts w:ascii="Calibri" w:hAnsi="Calibri" w:cs="Calibri"/>
+          <w:b/>
+          <w:bCs/>
+          <w:sz w:val="28"/>
+          <w:szCs w:val="28"/>
+          <w:lang w:val="de-DE"/>
+        </w:rPr>
+        <w:t>erneuern</w:t>
+      </w:r>
+      <w:r>
+        <w:rPr>
+          <w:rFonts w:ascii="Calibri" w:hAnsi="Calibri" w:cs="Calibri"/>
+          <w:b/>
+          <w:bCs/>
+          <w:sz w:val="28"/>
+          <w:szCs w:val="28"/>
+          <w:lang w:val="de-DE"/>
+        </w:rPr>
+        <w:t xml:space="preserve"> (falls abgelaufen):</w:t>
       </w:r>
     </w:p>
     <w:p>
@@ -3610,16 +4444,16 @@
         <w:jc w:val="both"/>
         <w:rPr>
           <w:rFonts w:ascii="Calibri" w:hAnsi="Calibri" w:cs="Calibri"/>
-          <w:sz w:val="28"/>
-          <w:szCs w:val="28"/>
-          <w:lang w:val="de-DE"/>
-        </w:rPr>
-      </w:pPr>
-      <w:r>
-        <w:rPr>
-          <w:rFonts w:ascii="Calibri" w:hAnsi="Calibri" w:cs="Calibri"/>
-          <w:sz w:val="28"/>
-          <w:szCs w:val="28"/>
+          <w:sz w:val="24"/>
+          <w:szCs w:val="24"/>
+          <w:lang w:val="de-DE"/>
+        </w:rPr>
+      </w:pPr>
+      <w:r>
+        <w:rPr>
+          <w:rFonts w:ascii="Calibri" w:hAnsi="Calibri" w:cs="Calibri"/>
+          <w:sz w:val="24"/>
+          <w:szCs w:val="24"/>
           <w:lang w:val="de-DE"/>
         </w:rPr>
         <w:t>Powershell als Admin ausführen</w:t>
@@ -3637,16 +4471,16 @@
         <w:jc w:val="both"/>
         <w:rPr>
           <w:rFonts w:ascii="Calibri" w:hAnsi="Calibri" w:cs="Calibri"/>
-          <w:sz w:val="28"/>
-          <w:szCs w:val="28"/>
-          <w:lang w:val="de-DE"/>
-        </w:rPr>
-      </w:pPr>
-      <w:r>
-        <w:rPr>
-          <w:rFonts w:ascii="Calibri" w:hAnsi="Calibri" w:cs="Calibri"/>
-          <w:sz w:val="28"/>
-          <w:szCs w:val="28"/>
+          <w:sz w:val="24"/>
+          <w:szCs w:val="24"/>
+          <w:lang w:val="de-DE"/>
+        </w:rPr>
+      </w:pPr>
+      <w:r>
+        <w:rPr>
+          <w:rFonts w:ascii="Calibri" w:hAnsi="Calibri" w:cs="Calibri"/>
+          <w:sz w:val="24"/>
+          <w:szCs w:val="24"/>
           <w:lang w:val="de-DE"/>
         </w:rPr>
         <w:t>Mkcert installieren</w:t>
@@ -3654,8 +4488,8 @@
       <w:r>
         <w:rPr>
           <w:rFonts w:ascii="Calibri" w:hAnsi="Calibri" w:cs="Calibri"/>
-          <w:sz w:val="28"/>
-          <w:szCs w:val="28"/>
+          <w:sz w:val="24"/>
+          <w:szCs w:val="24"/>
           <w:lang w:val="de-DE"/>
         </w:rPr>
         <w:t>:</w:t>
@@ -3673,116 +4507,87 @@
         <w:jc w:val="both"/>
         <w:rPr>
           <w:rFonts w:ascii="Calibri" w:hAnsi="Calibri" w:cs="Calibri"/>
-          <w:sz w:val="28"/>
-          <w:szCs w:val="28"/>
-          <w:lang w:val="de-DE"/>
-        </w:rPr>
-      </w:pPr>
-      <w:r>
-        <w:rPr>
-          <w:rFonts w:ascii="Calibri" w:hAnsi="Calibri" w:cs="Calibri"/>
-          <w:sz w:val="28"/>
-          <w:szCs w:val="28"/>
-          <w:lang w:val="de-DE"/>
-        </w:rPr>
-        <w:t>E</w:t>
-      </w:r>
-      <w:r>
-        <w:rPr>
-          <w:rFonts w:ascii="Calibri" w:hAnsi="Calibri" w:cs="Calibri"/>
-          <w:sz w:val="28"/>
-          <w:szCs w:val="28"/>
-          <w:lang w:val="de-DE"/>
-        </w:rPr>
-        <w:t xml:space="preserve">ingeben und ausführen: </w:t>
-      </w:r>
-      <w:r>
-        <w:rPr>
-          <w:rFonts w:ascii="Calibri" w:hAnsi="Calibri" w:cs="Calibri"/>
-          <w:b/>
-          <w:bCs/>
-          <w:sz w:val="28"/>
-          <w:szCs w:val="28"/>
-          <w:lang w:val="de-DE"/>
-        </w:rPr>
-        <w:fldChar w:fldCharType="begin"/>
-      </w:r>
-      <w:r>
-        <w:rPr>
-          <w:rFonts w:ascii="Calibri" w:hAnsi="Calibri" w:cs="Calibri"/>
-          <w:b/>
-          <w:bCs/>
-          <w:sz w:val="28"/>
-          <w:szCs w:val="28"/>
-          <w:lang w:val="de-DE"/>
-        </w:rPr>
-        <w:instrText>HYPERLINK "</w:instrText>
-      </w:r>
-      <w:r>
-        <w:rPr>
-          <w:rFonts w:ascii="Calibri" w:hAnsi="Calibri" w:cs="Calibri"/>
-          <w:b/>
-          <w:bCs/>
-          <w:sz w:val="28"/>
-          <w:szCs w:val="28"/>
-          <w:lang w:val="de-DE"/>
-        </w:rPr>
-        <w:instrText>https://community.chocolatey.org/install.ps1</w:instrText>
-      </w:r>
-      <w:r>
-        <w:rPr>
-          <w:rFonts w:ascii="Calibri" w:hAnsi="Calibri" w:cs="Calibri"/>
-          <w:b/>
-          <w:bCs/>
-          <w:sz w:val="28"/>
-          <w:szCs w:val="28"/>
-          <w:lang w:val="de-DE"/>
-        </w:rPr>
-        <w:instrText>"</w:instrText>
-      </w:r>
-      <w:r>
-        <w:rPr>
-          <w:rFonts w:ascii="Calibri" w:hAnsi="Calibri" w:cs="Calibri"/>
-          <w:b/>
-          <w:bCs/>
-          <w:sz w:val="28"/>
-          <w:szCs w:val="28"/>
-          <w:lang w:val="de-DE"/>
-        </w:rPr>
-      </w:r>
-      <w:r>
-        <w:rPr>
-          <w:rFonts w:ascii="Calibri" w:hAnsi="Calibri" w:cs="Calibri"/>
-          <w:b/>
-          <w:bCs/>
-          <w:sz w:val="28"/>
-          <w:szCs w:val="28"/>
-          <w:lang w:val="de-DE"/>
-        </w:rPr>
-        <w:fldChar w:fldCharType="separate"/>
-      </w:r>
-      <w:r>
-        <w:rPr>
-          <w:rStyle w:val="Hyperlink"/>
-          <w:rFonts w:ascii="Calibri" w:hAnsi="Calibri" w:cs="Calibri"/>
-          <w:b/>
-          <w:bCs/>
-          <w:sz w:val="28"/>
-          <w:szCs w:val="28"/>
-          <w:lang w:val="de-DE"/>
-        </w:rPr>
-        <w:t>https://community.chocolatey.org/install.ps1</w:t>
-      </w:r>
-      <w:r>
-        <w:rPr>
-          <w:rFonts w:ascii="Calibri" w:hAnsi="Calibri" w:cs="Calibri"/>
-          <w:b/>
-          <w:bCs/>
-          <w:sz w:val="28"/>
-          <w:szCs w:val="28"/>
-          <w:lang w:val="de-DE"/>
-        </w:rPr>
-        <w:fldChar w:fldCharType="end"/>
+          <w:sz w:val="24"/>
+          <w:szCs w:val="24"/>
+          <w:lang w:val="de-DE"/>
+        </w:rPr>
+      </w:pPr>
+      <w:r>
+        <w:rPr>
+          <w:rFonts w:ascii="Calibri" w:hAnsi="Calibri" w:cs="Calibri"/>
+          <w:sz w:val="24"/>
+          <w:szCs w:val="24"/>
+          <w:lang w:val="de-DE"/>
+        </w:rPr>
+        <w:t xml:space="preserve">Link öffnen, </w:t>
+      </w:r>
+      <w:r>
+        <w:rPr>
+          <w:rFonts w:ascii="Calibri" w:hAnsi="Calibri" w:cs="Calibri"/>
+          <w:sz w:val="24"/>
+          <w:szCs w:val="24"/>
+          <w:lang w:val="de-DE"/>
+        </w:rPr>
+        <w:t xml:space="preserve">Inhalt </w:t>
+      </w:r>
+      <w:r>
+        <w:rPr>
+          <w:rFonts w:ascii="Calibri" w:hAnsi="Calibri" w:cs="Calibri"/>
+          <w:sz w:val="24"/>
+          <w:szCs w:val="24"/>
+          <w:lang w:val="de-DE"/>
+        </w:rPr>
+        <w:t xml:space="preserve">kopieren und in Powershell </w:t>
+      </w:r>
+      <w:r>
+        <w:rPr>
+          <w:rFonts w:ascii="Calibri" w:hAnsi="Calibri" w:cs="Calibri"/>
+          <w:sz w:val="24"/>
+          <w:szCs w:val="24"/>
+          <w:lang w:val="de-DE"/>
+        </w:rPr>
+        <w:t xml:space="preserve">ausführen: </w:t>
+      </w:r>
+      <w:hyperlink r:id="rId14" w:history="1">
+        <w:r>
+          <w:rPr>
+            <w:rStyle w:val="Hyperlink"/>
+            <w:rFonts w:ascii="Calibri" w:hAnsi="Calibri" w:cs="Calibri"/>
+            <w:b/>
+            <w:bCs/>
+            <w:sz w:val="24"/>
+            <w:szCs w:val="24"/>
+            <w:lang w:val="de-DE"/>
+          </w:rPr>
+          <w:t>https://community.chocolatey.org/install.ps1</w:t>
+        </w:r>
+      </w:hyperlink>
+    </w:p>
+    <w:p>
+      <w:pPr>
+        <w:pStyle w:val="ListParagraph"/>
+        <w:numPr>
+          <w:ilvl w:val="0"/>
+          <w:numId w:val="23"/>
+        </w:numPr>
+        <w:spacing w:before="240" w:after="0" w:line="240" w:lineRule="auto"/>
+        <w:ind w:right="-425"/>
+        <w:jc w:val="both"/>
+        <w:rPr>
+          <w:rFonts w:ascii="Calibri" w:hAnsi="Calibri" w:cs="Calibri"/>
+          <w:sz w:val="24"/>
+          <w:szCs w:val="24"/>
+          <w:lang w:val="de-DE"/>
+        </w:rPr>
+      </w:pPr>
+      <w:r>
+        <w:rPr>
+          <w:rFonts w:ascii="Calibri" w:hAnsi="Calibri" w:cs="Calibri"/>
+          <w:sz w:val="24"/>
+          <w:szCs w:val="24"/>
+          <w:lang w:val="de-DE"/>
+        </w:rPr>
+        <w:t>Choco install mkcert</w:t>
       </w:r>
     </w:p>
     <w:p>
@@ -3797,16 +4602,16 @@
         <w:jc w:val="both"/>
         <w:rPr>
           <w:rFonts w:ascii="Calibri" w:hAnsi="Calibri" w:cs="Calibri"/>
-          <w:sz w:val="28"/>
-          <w:szCs w:val="28"/>
-          <w:lang w:val="de-DE"/>
-        </w:rPr>
-      </w:pPr>
-      <w:r>
-        <w:rPr>
-          <w:rFonts w:ascii="Calibri" w:hAnsi="Calibri" w:cs="Calibri"/>
-          <w:sz w:val="28"/>
-          <w:szCs w:val="28"/>
+          <w:sz w:val="24"/>
+          <w:szCs w:val="24"/>
+          <w:lang w:val="de-DE"/>
+        </w:rPr>
+      </w:pPr>
+      <w:r>
+        <w:rPr>
+          <w:rFonts w:ascii="Calibri" w:hAnsi="Calibri" w:cs="Calibri"/>
+          <w:sz w:val="24"/>
+          <w:szCs w:val="24"/>
           <w:lang w:val="de-DE"/>
         </w:rPr>
         <w:t>Programverzeichnis öffnen (cd C:\...)</w:t>
@@ -3824,19 +4629,28 @@
         <w:jc w:val="both"/>
         <w:rPr>
           <w:rFonts w:ascii="Calibri" w:hAnsi="Calibri" w:cs="Calibri"/>
-          <w:sz w:val="28"/>
-          <w:szCs w:val="28"/>
-          <w:lang w:val="de-DE"/>
-        </w:rPr>
-      </w:pPr>
-      <w:r>
-        <w:rPr>
-          <w:rFonts w:ascii="Calibri" w:hAnsi="Calibri" w:cs="Calibri"/>
-          <w:sz w:val="28"/>
-          <w:szCs w:val="28"/>
+          <w:sz w:val="24"/>
+          <w:szCs w:val="24"/>
+          <w:lang w:val="de-DE"/>
+        </w:rPr>
+      </w:pPr>
+      <w:r>
+        <w:rPr>
+          <w:rFonts w:ascii="Calibri" w:hAnsi="Calibri" w:cs="Calibri"/>
+          <w:sz w:val="24"/>
+          <w:szCs w:val="24"/>
           <w:lang w:val="de-DE"/>
         </w:rPr>
         <w:t>mkcert -install</w:t>
+      </w:r>
+      <w:r>
+        <w:rPr>
+          <w:rFonts w:ascii="Calibri" w:hAnsi="Calibri" w:cs="Calibri"/>
+          <w:sz w:val="24"/>
+          <w:szCs w:val="24"/>
+          <w:lang w:val="de-DE"/>
+        </w:rPr>
+        <w:t xml:space="preserve"> (Auf Meldung Ja klicken)</w:t>
       </w:r>
     </w:p>
     <w:p>
@@ -3851,16 +4665,16 @@
         <w:jc w:val="both"/>
         <w:rPr>
           <w:rFonts w:ascii="Calibri" w:hAnsi="Calibri" w:cs="Calibri"/>
-          <w:sz w:val="28"/>
-          <w:szCs w:val="28"/>
+          <w:sz w:val="24"/>
+          <w:szCs w:val="24"/>
         </w:rPr>
       </w:pPr>
       <w:proofErr w:type="spellStart"/>
       <w:r>
         <w:rPr>
           <w:rFonts w:ascii="Calibri" w:hAnsi="Calibri" w:cs="Calibri"/>
-          <w:sz w:val="28"/>
-          <w:szCs w:val="28"/>
+          <w:sz w:val="24"/>
+          <w:szCs w:val="24"/>
         </w:rPr>
         <w:t>mkcert</w:t>
       </w:r>
@@ -3868,34 +4682,26 @@
       <w:r>
         <w:rPr>
           <w:rFonts w:ascii="Calibri" w:hAnsi="Calibri" w:cs="Calibri"/>
-          <w:sz w:val="28"/>
-          <w:szCs w:val="28"/>
-        </w:rPr>
-        <w:t xml:space="preserve"> localhost 127.0.0.1 </w:t>
-      </w:r>
-      <w:r>
-        <w:rPr>
-          <w:rFonts w:ascii="Calibri" w:hAnsi="Calibri" w:cs="Calibri"/>
-          <w:sz w:val="28"/>
-          <w:szCs w:val="28"/>
-        </w:rPr>
-        <w:t>“</w:t>
-      </w:r>
-      <w:r>
-        <w:rPr>
-          <w:rFonts w:ascii="Calibri" w:hAnsi="Calibri" w:cs="Calibri"/>
-          <w:sz w:val="28"/>
-          <w:szCs w:val="28"/>
-        </w:rPr>
-        <w:t>*0ad005.onehc.n</w:t>
-      </w:r>
-      <w:r>
-        <w:rPr>
-          <w:rFonts w:ascii="Calibri" w:hAnsi="Calibri" w:cs="Calibri"/>
-          <w:sz w:val="28"/>
-          <w:szCs w:val="28"/>
-        </w:rPr>
-        <w:t>et”</w:t>
+          <w:sz w:val="24"/>
+          <w:szCs w:val="24"/>
+        </w:rPr>
+        <w:t xml:space="preserve"> localhost 127.0.0.1 “*</w:t>
+      </w:r>
+      <w:r>
+        <w:rPr>
+          <w:rFonts w:ascii="Calibri" w:hAnsi="Calibri" w:cs="Calibri"/>
+          <w:sz w:val="24"/>
+          <w:szCs w:val="24"/>
+        </w:rPr>
+        <w:t>.</w:t>
+      </w:r>
+      <w:r>
+        <w:rPr>
+          <w:rFonts w:ascii="Calibri" w:hAnsi="Calibri" w:cs="Calibri"/>
+          <w:sz w:val="24"/>
+          <w:szCs w:val="24"/>
+        </w:rPr>
+        <w:t>ad005.onehc.net”</w:t>
       </w:r>
     </w:p>
     <w:p>
@@ -3910,16 +4716,16 @@
         <w:jc w:val="both"/>
         <w:rPr>
           <w:rFonts w:ascii="Calibri" w:hAnsi="Calibri" w:cs="Calibri"/>
-          <w:sz w:val="28"/>
-          <w:szCs w:val="28"/>
-          <w:lang w:val="de-DE"/>
-        </w:rPr>
-      </w:pPr>
-      <w:r>
-        <w:rPr>
-          <w:rFonts w:ascii="Calibri" w:hAnsi="Calibri" w:cs="Calibri"/>
-          <w:sz w:val="28"/>
-          <w:szCs w:val="28"/>
+          <w:sz w:val="24"/>
+          <w:szCs w:val="24"/>
+          <w:lang w:val="de-DE"/>
+        </w:rPr>
+      </w:pPr>
+      <w:r>
+        <w:rPr>
+          <w:rFonts w:ascii="Calibri" w:hAnsi="Calibri" w:cs="Calibri"/>
+          <w:sz w:val="24"/>
+          <w:szCs w:val="24"/>
           <w:lang w:val="de-DE"/>
         </w:rPr>
         <w:t>G</w:t>
@@ -3927,8 +4733,8 @@
       <w:r>
         <w:rPr>
           <w:rFonts w:ascii="Calibri" w:hAnsi="Calibri" w:cs="Calibri"/>
-          <w:sz w:val="28"/>
-          <w:szCs w:val="28"/>
+          <w:sz w:val="24"/>
+          <w:szCs w:val="24"/>
           <w:lang w:val="de-DE"/>
         </w:rPr>
         <w:t xml:space="preserve">enerierte </w:t>
@@ -3936,8 +4742,8 @@
       <w:r>
         <w:rPr>
           <w:rFonts w:ascii="Calibri" w:hAnsi="Calibri" w:cs="Calibri"/>
-          <w:sz w:val="28"/>
-          <w:szCs w:val="28"/>
+          <w:sz w:val="24"/>
+          <w:szCs w:val="24"/>
           <w:lang w:val="de-DE"/>
         </w:rPr>
         <w:t>‘</w:t>
@@ -3945,8 +4751,8 @@
       <w:r>
         <w:rPr>
           <w:rFonts w:ascii="Calibri" w:hAnsi="Calibri" w:cs="Calibri"/>
-          <w:sz w:val="28"/>
-          <w:szCs w:val="28"/>
+          <w:sz w:val="24"/>
+          <w:szCs w:val="24"/>
           <w:lang w:val="de-DE"/>
         </w:rPr>
         <w:t>.pem</w:t>
@@ -3954,8 +4760,8 @@
       <w:r>
         <w:rPr>
           <w:rFonts w:ascii="Calibri" w:hAnsi="Calibri" w:cs="Calibri"/>
-          <w:sz w:val="28"/>
-          <w:szCs w:val="28"/>
+          <w:sz w:val="24"/>
+          <w:szCs w:val="24"/>
           <w:lang w:val="de-DE"/>
         </w:rPr>
         <w:t>‘</w:t>
@@ -3963,8 +4769,44 @@
       <w:r>
         <w:rPr>
           <w:rFonts w:ascii="Calibri" w:hAnsi="Calibri" w:cs="Calibri"/>
-          <w:sz w:val="28"/>
-          <w:szCs w:val="28"/>
+          <w:sz w:val="24"/>
+          <w:szCs w:val="24"/>
+          <w:lang w:val="de-DE"/>
+        </w:rPr>
+        <w:t xml:space="preserve"> </w:t>
+      </w:r>
+      <w:r>
+        <w:rPr>
+          <w:rFonts w:ascii="Calibri" w:hAnsi="Calibri" w:cs="Calibri"/>
+          <w:sz w:val="24"/>
+          <w:szCs w:val="24"/>
+          <w:lang w:val="de-DE"/>
+        </w:rPr>
+        <w:t xml:space="preserve">Dateien </w:t>
+      </w:r>
+      <w:r>
+        <w:rPr>
+          <w:rFonts w:ascii="Calibri" w:hAnsi="Calibri" w:cs="Calibri"/>
+          <w:sz w:val="24"/>
+          <w:szCs w:val="24"/>
+          <w:lang w:val="de-DE"/>
+        </w:rPr>
+        <w:t xml:space="preserve">auf „localhost+1.pem“ und „localhost+1-key.pem“ </w:t>
+      </w:r>
+      <w:r>
+        <w:rPr>
+          <w:rFonts w:ascii="Calibri" w:hAnsi="Calibri" w:cs="Calibri"/>
+          <w:sz w:val="24"/>
+          <w:szCs w:val="24"/>
+          <w:lang w:val="de-DE"/>
+        </w:rPr>
+        <w:t>umbenennen</w:t>
+      </w:r>
+      <w:r>
+        <w:rPr>
+          <w:rFonts w:ascii="Calibri" w:hAnsi="Calibri" w:cs="Calibri"/>
+          <w:sz w:val="24"/>
+          <w:szCs w:val="24"/>
           <w:lang w:val="de-DE"/>
         </w:rPr>
         <w:t xml:space="preserve"> und </w:t>
@@ -3972,53 +4814,8 @@
       <w:r>
         <w:rPr>
           <w:rFonts w:ascii="Calibri" w:hAnsi="Calibri" w:cs="Calibri"/>
-          <w:sz w:val="28"/>
-          <w:szCs w:val="28"/>
-          <w:lang w:val="de-DE"/>
-        </w:rPr>
-        <w:t>‘</w:t>
-      </w:r>
-      <w:r>
-        <w:rPr>
-          <w:rFonts w:ascii="Calibri" w:hAnsi="Calibri" w:cs="Calibri"/>
-          <w:sz w:val="28"/>
-          <w:szCs w:val="28"/>
-          <w:lang w:val="de-DE"/>
-        </w:rPr>
-        <w:t>.key</w:t>
-      </w:r>
-      <w:r>
-        <w:rPr>
-          <w:rFonts w:ascii="Calibri" w:hAnsi="Calibri" w:cs="Calibri"/>
-          <w:sz w:val="28"/>
-          <w:szCs w:val="28"/>
-          <w:lang w:val="de-DE"/>
-        </w:rPr>
-        <w:t>‘</w:t>
-      </w:r>
-      <w:r>
-        <w:rPr>
-          <w:rFonts w:ascii="Calibri" w:hAnsi="Calibri" w:cs="Calibri"/>
-          <w:sz w:val="28"/>
-          <w:szCs w:val="28"/>
-          <w:lang w:val="de-DE"/>
-        </w:rPr>
-        <w:t xml:space="preserve"> Dateien </w:t>
-      </w:r>
-      <w:r>
-        <w:rPr>
-          <w:rFonts w:ascii="Calibri" w:hAnsi="Calibri" w:cs="Calibri"/>
-          <w:sz w:val="28"/>
-          <w:szCs w:val="28"/>
-          <w:lang w:val="de-DE"/>
-        </w:rPr>
-        <w:t xml:space="preserve">gleichermaßen wie die alten umbenennen, </w:t>
-      </w:r>
-      <w:r>
-        <w:rPr>
-          <w:rFonts w:ascii="Calibri" w:hAnsi="Calibri" w:cs="Calibri"/>
-          <w:sz w:val="28"/>
-          <w:szCs w:val="28"/>
+          <w:sz w:val="24"/>
+          <w:szCs w:val="24"/>
           <w:lang w:val="de-DE"/>
         </w:rPr>
         <w:t>in den Programordner einfügen</w:t>
@@ -4026,11 +4823,230 @@
       <w:r>
         <w:rPr>
           <w:rFonts w:ascii="Calibri" w:hAnsi="Calibri" w:cs="Calibri"/>
-          <w:sz w:val="28"/>
-          <w:szCs w:val="28"/>
+          <w:sz w:val="24"/>
+          <w:szCs w:val="24"/>
           <w:lang w:val="de-DE"/>
         </w:rPr>
         <w:t xml:space="preserve"> bzw. Die alten ersetzen.</w:t>
+      </w:r>
+      <w:r>
+        <w:rPr>
+          <w:rFonts w:ascii="Calibri" w:hAnsi="Calibri" w:cs="Calibri"/>
+          <w:sz w:val="24"/>
+          <w:szCs w:val="24"/>
+          <w:lang w:val="de-DE"/>
+        </w:rPr>
+        <w:t xml:space="preserve"> Aktuelles Zertifikat ist bis </w:t>
+      </w:r>
+      <w:r>
+        <w:rPr>
+          <w:rFonts w:ascii="Calibri" w:hAnsi="Calibri" w:cs="Calibri"/>
+          <w:sz w:val="24"/>
+          <w:szCs w:val="24"/>
+          <w:lang w:val="de-DE"/>
+        </w:rPr>
+        <w:t>August</w:t>
+      </w:r>
+      <w:r>
+        <w:rPr>
+          <w:rFonts w:ascii="Calibri" w:hAnsi="Calibri" w:cs="Calibri"/>
+          <w:sz w:val="24"/>
+          <w:szCs w:val="24"/>
+          <w:lang w:val="de-DE"/>
+        </w:rPr>
+        <w:t xml:space="preserve"> 2028 gültig.</w:t>
+      </w:r>
+    </w:p>
+    <w:p>
+      <w:pPr>
+        <w:pStyle w:val="ListParagraph"/>
+        <w:numPr>
+          <w:ilvl w:val="0"/>
+          <w:numId w:val="22"/>
+        </w:numPr>
+        <w:spacing w:before="240" w:after="0" w:line="240" w:lineRule="auto"/>
+        <w:ind w:right="-425"/>
+        <w:jc w:val="both"/>
+        <w:rPr>
+          <w:rFonts w:ascii="Calibri" w:hAnsi="Calibri" w:cs="Calibri"/>
+          <w:sz w:val="24"/>
+          <w:szCs w:val="24"/>
+          <w:lang w:val="de-DE"/>
+        </w:rPr>
+      </w:pPr>
+      <w:r>
+        <w:rPr>
+          <w:rFonts w:ascii="Calibri" w:hAnsi="Calibri" w:cs="Calibri"/>
+          <w:sz w:val="24"/>
+          <w:szCs w:val="24"/>
+          <w:lang w:val="de-DE"/>
+        </w:rPr>
+        <w:t xml:space="preserve">Im Browser Zertifikat exportieren, auf „rootCertificate“ umbenennen und in </w:t>
+      </w:r>
+      <w:r>
+        <w:rPr>
+          <w:rFonts w:ascii="Calibri" w:hAnsi="Calibri" w:cs="Calibri"/>
+          <w:sz w:val="24"/>
+          <w:szCs w:val="24"/>
+          <w:lang w:val="de-DE"/>
+        </w:rPr>
+        <w:t>Executable -&gt; Certificates einfügen.</w:t>
+      </w:r>
+    </w:p>
+    <w:p>
+      <w:pPr>
+        <w:pStyle w:val="ListParagraph"/>
+        <w:numPr>
+          <w:ilvl w:val="0"/>
+          <w:numId w:val="22"/>
+        </w:numPr>
+        <w:spacing w:before="240" w:after="0" w:line="240" w:lineRule="auto"/>
+        <w:ind w:right="-425"/>
+        <w:jc w:val="both"/>
+        <w:rPr>
+          <w:rFonts w:ascii="Calibri" w:hAnsi="Calibri" w:cs="Calibri"/>
+          <w:sz w:val="24"/>
+          <w:szCs w:val="24"/>
+        </w:rPr>
+      </w:pPr>
+      <w:r>
+        <w:rPr>
+          <w:rFonts w:ascii="Calibri" w:hAnsi="Calibri" w:cs="Calibri"/>
+          <w:sz w:val="24"/>
+          <w:szCs w:val="24"/>
+        </w:rPr>
+        <w:t xml:space="preserve">In </w:t>
+      </w:r>
+      <w:r>
+        <w:rPr>
+          <w:rFonts w:ascii="Calibri" w:hAnsi="Calibri" w:cs="Calibri"/>
+          <w:sz w:val="24"/>
+          <w:szCs w:val="24"/>
+        </w:rPr>
+        <w:t>C:\Users\</w:t>
+      </w:r>
+      <w:r>
+        <w:rPr>
+          <w:rFonts w:ascii="Calibri" w:hAnsi="Calibri" w:cs="Calibri"/>
+          <w:sz w:val="24"/>
+          <w:szCs w:val="24"/>
+        </w:rPr>
+        <w:t>CurrentUser</w:t>
+      </w:r>
+      <w:r>
+        <w:rPr>
+          <w:rFonts w:ascii="Calibri" w:hAnsi="Calibri" w:cs="Calibri"/>
+          <w:sz w:val="24"/>
+          <w:szCs w:val="24"/>
+        </w:rPr>
+        <w:t>\AppData\Local\mkcert</w:t>
+      </w:r>
+      <w:r>
+        <w:rPr>
+          <w:rFonts w:ascii="Calibri" w:hAnsi="Calibri" w:cs="Calibri"/>
+          <w:sz w:val="24"/>
+          <w:szCs w:val="24"/>
+        </w:rPr>
+        <w:t xml:space="preserve"> </w:t>
+      </w:r>
+      <w:proofErr w:type="spellStart"/>
+      <w:r>
+        <w:rPr>
+          <w:rFonts w:ascii="Calibri" w:hAnsi="Calibri" w:cs="Calibri"/>
+          <w:b/>
+          <w:bCs/>
+          <w:sz w:val="24"/>
+          <w:szCs w:val="24"/>
+        </w:rPr>
+        <w:t>rootCA.pem</w:t>
+      </w:r>
+      <w:proofErr w:type="spellEnd"/>
+      <w:r>
+        <w:rPr>
+          <w:rFonts w:ascii="Calibri" w:hAnsi="Calibri" w:cs="Calibri"/>
+          <w:sz w:val="24"/>
+          <w:szCs w:val="24"/>
+        </w:rPr>
+        <w:t xml:space="preserve"> </w:t>
+      </w:r>
+      <w:proofErr w:type="spellStart"/>
+      <w:r>
+        <w:rPr>
+          <w:rFonts w:ascii="Calibri" w:hAnsi="Calibri" w:cs="Calibri"/>
+          <w:sz w:val="24"/>
+          <w:szCs w:val="24"/>
+        </w:rPr>
+        <w:t>kopieren</w:t>
+      </w:r>
+      <w:proofErr w:type="spellEnd"/>
+      <w:r>
+        <w:rPr>
+          <w:rFonts w:ascii="Calibri" w:hAnsi="Calibri" w:cs="Calibri"/>
+          <w:sz w:val="24"/>
+          <w:szCs w:val="24"/>
+        </w:rPr>
+        <w:t xml:space="preserve"> und in </w:t>
+      </w:r>
+      <w:r>
+        <w:rPr>
+          <w:rFonts w:ascii="Calibri" w:hAnsi="Calibri" w:cs="Calibri"/>
+          <w:sz w:val="24"/>
+          <w:szCs w:val="24"/>
+        </w:rPr>
+        <w:t>Executable -&gt; Certificates</w:t>
+      </w:r>
+      <w:r>
+        <w:rPr>
+          <w:rFonts w:ascii="Calibri" w:hAnsi="Calibri" w:cs="Calibri"/>
+          <w:sz w:val="24"/>
+          <w:szCs w:val="24"/>
+        </w:rPr>
+        <w:t xml:space="preserve"> </w:t>
+      </w:r>
+      <w:proofErr w:type="spellStart"/>
+      <w:r>
+        <w:rPr>
+          <w:rFonts w:ascii="Calibri" w:hAnsi="Calibri" w:cs="Calibri"/>
+          <w:sz w:val="24"/>
+          <w:szCs w:val="24"/>
+        </w:rPr>
+        <w:t>einfügen</w:t>
+      </w:r>
+      <w:proofErr w:type="spellEnd"/>
+      <w:r>
+        <w:rPr>
+          <w:rFonts w:ascii="Calibri" w:hAnsi="Calibri" w:cs="Calibri"/>
+          <w:sz w:val="24"/>
+          <w:szCs w:val="24"/>
+        </w:rPr>
+        <w:t>.</w:t>
+      </w:r>
+    </w:p>
+    <w:p>
+      <w:pPr>
+        <w:pStyle w:val="ListParagraph"/>
+        <w:numPr>
+          <w:ilvl w:val="0"/>
+          <w:numId w:val="22"/>
+        </w:numPr>
+        <w:spacing w:before="240" w:after="0" w:line="240" w:lineRule="auto"/>
+        <w:ind w:right="-425"/>
+        <w:jc w:val="both"/>
+        <w:rPr>
+          <w:rFonts w:ascii="Calibri" w:hAnsi="Calibri" w:cs="Calibri"/>
+          <w:sz w:val="24"/>
+          <w:szCs w:val="24"/>
+          <w:lang w:val="de-DE"/>
+        </w:rPr>
+      </w:pPr>
+      <w:r>
+        <w:rPr>
+          <w:rFonts w:ascii="Calibri" w:hAnsi="Calibri" w:cs="Calibri"/>
+          <w:sz w:val="24"/>
+          <w:szCs w:val="24"/>
+          <w:lang w:val="de-DE"/>
+        </w:rPr>
+        <w:t>Sicherheitszertifikat erneut auf remote Clients installieren.</w:t>
       </w:r>
     </w:p>
     <w:p>
@@ -4068,7 +5084,7 @@
                     <pic:cNvPicPr/>
                   </pic:nvPicPr>
                   <pic:blipFill>
-                    <a:blip r:embed="rId14"/>
+                    <a:blip r:embed="rId15"/>
                     <a:stretch>
                       <a:fillRect/>
                     </a:stretch>
@@ -4107,7 +5123,7 @@
         <w:pStyle w:val="ListParagraph"/>
         <w:numPr>
           <w:ilvl w:val="0"/>
-          <w:numId w:val="13"/>
+          <w:numId w:val="12"/>
         </w:numPr>
         <w:spacing w:before="240" w:after="0" w:line="240" w:lineRule="auto"/>
         <w:ind w:right="-425"/>
@@ -4210,108 +5226,8 @@
           <w:szCs w:val="28"/>
           <w:lang w:val="de-DE"/>
         </w:rPr>
-        <w:t xml:space="preserve">Bei erster Ausführung des Programs auf einem PC ist es empfohlen eine </w:t>
-      </w:r>
-      <w:r>
-        <w:rPr>
-          <w:rFonts w:ascii="Calibri" w:hAnsi="Calibri" w:cs="Calibri"/>
-          <w:b/>
-          <w:bCs/>
-          <w:sz w:val="28"/>
-          <w:szCs w:val="28"/>
-          <w:lang w:val="de-DE"/>
-        </w:rPr>
-        <w:t>Inbound Regel</w:t>
-      </w:r>
-      <w:r>
-        <w:rPr>
-          <w:rFonts w:ascii="Calibri" w:hAnsi="Calibri" w:cs="Calibri"/>
-          <w:sz w:val="28"/>
-          <w:szCs w:val="28"/>
-          <w:lang w:val="de-DE"/>
-        </w:rPr>
-        <w:t xml:space="preserve"> im Firewall anzulegen und der verwendete Port zulassen, damit eine Verbindung außerhalb des Arbeitsplatzes möglich ist: Firewall öffnen -&gt; Netwerks</w:t>
-      </w:r>
-      <w:r>
-        <w:rPr>
-          <w:rFonts w:ascii="Calibri" w:hAnsi="Calibri" w:cs="Calibri"/>
-          <w:sz w:val="28"/>
-          <w:szCs w:val="28"/>
-          <w:lang w:val="de-DE"/>
-        </w:rPr>
-        <w:t>c</w:t>
-      </w:r>
-      <w:r>
-        <w:rPr>
-          <w:rFonts w:ascii="Calibri" w:hAnsi="Calibri" w:cs="Calibri"/>
-          <w:sz w:val="28"/>
-          <w:szCs w:val="28"/>
-          <w:lang w:val="de-DE"/>
-        </w:rPr>
-        <w:t>hutz -&gt; Erw</w:t>
-      </w:r>
-      <w:r>
-        <w:rPr>
-          <w:rFonts w:ascii="Calibri" w:hAnsi="Calibri" w:cs="Calibri"/>
-          <w:sz w:val="28"/>
-          <w:szCs w:val="28"/>
-          <w:lang w:val="de-DE"/>
-        </w:rPr>
-        <w:t>e</w:t>
-      </w:r>
-      <w:r>
-        <w:rPr>
-          <w:rFonts w:ascii="Calibri" w:hAnsi="Calibri" w:cs="Calibri"/>
-          <w:sz w:val="28"/>
-          <w:szCs w:val="28"/>
-          <w:lang w:val="de-DE"/>
-        </w:rPr>
-        <w:t xml:space="preserve">iterte Einstellungen -&gt; </w:t>
-      </w:r>
-      <w:r>
-        <w:rPr>
-          <w:rFonts w:ascii="Calibri" w:hAnsi="Calibri" w:cs="Calibri"/>
-          <w:sz w:val="28"/>
-          <w:szCs w:val="28"/>
-          <w:lang w:val="de-DE"/>
-        </w:rPr>
-        <w:t>Inbound Rules.</w:t>
-      </w:r>
-    </w:p>
-    <w:p>
-      <w:pPr>
-        <w:spacing w:before="240" w:after="0" w:line="240" w:lineRule="auto"/>
-        <w:ind w:right="-425"/>
-        <w:jc w:val="both"/>
-        <w:rPr>
-          <w:rFonts w:ascii="Calibri" w:hAnsi="Calibri" w:cs="Calibri"/>
-          <w:sz w:val="28"/>
-          <w:szCs w:val="28"/>
-          <w:lang w:val="de-DE"/>
-        </w:rPr>
-      </w:pPr>
-      <w:r>
-        <w:rPr>
-          <w:rFonts w:ascii="Calibri" w:hAnsi="Calibri" w:cs="Calibri"/>
-          <w:sz w:val="28"/>
-          <w:szCs w:val="28"/>
-          <w:lang w:val="de-DE"/>
-        </w:rPr>
         <w:t>Das Program als Startup Program festlegen, damit es nach Startup automatisch ausgeführt wird.</w:t>
       </w:r>
-    </w:p>
-    <w:p>
-      <w:pPr>
-        <w:spacing w:before="240" w:after="0" w:line="240" w:lineRule="auto"/>
-        <w:ind w:right="-425"/>
-        <w:jc w:val="both"/>
-        <w:rPr>
-          <w:rFonts w:ascii="Calibri" w:hAnsi="Calibri" w:cs="Calibri"/>
-          <w:sz w:val="28"/>
-          <w:szCs w:val="28"/>
-          <w:lang w:val="de-DE"/>
-        </w:rPr>
-      </w:pPr>
     </w:p>
     <w:p>
       <w:pPr>
@@ -4643,18 +5559,7 @@
           <w:szCs w:val="28"/>
           <w:lang w:val="de-DE"/>
         </w:rPr>
-        <w:t xml:space="preserve">: </w:t>
-      </w:r>
-      <w:r>
-        <w:rPr>
-          <w:rFonts w:ascii="Calibri" w:hAnsi="Calibri" w:cs="Calibri"/>
-          <w:b/>
-          <w:bCs/>
-          <w:sz w:val="28"/>
-          <w:szCs w:val="28"/>
-          <w:lang w:val="de-DE"/>
-        </w:rPr>
-        <w:t>Serverprogram</w:t>
+        <w:t>: Serverprogram</w:t>
       </w:r>
     </w:p>
     <w:p>
@@ -4716,6 +5621,7 @@
       <w:r>
         <w:rPr>
           <w:rFonts w:ascii="Calibri" w:hAnsi="Calibri" w:cs="Calibri"/>
+          <w:noProof/>
           <w:sz w:val="28"/>
           <w:szCs w:val="28"/>
           <w:lang w:val="de-DE"/>
@@ -4736,7 +5642,7 @@
                     <pic:cNvPicPr/>
                   </pic:nvPicPr>
                   <pic:blipFill>
-                    <a:blip r:embed="rId15"/>
+                    <a:blip r:embed="rId16"/>
                     <a:stretch>
                       <a:fillRect/>
                     </a:stretch>
@@ -4928,6 +5834,7 @@
       <w:r>
         <w:rPr>
           <w:rFonts w:ascii="Calibri" w:hAnsi="Calibri" w:cs="Calibri"/>
+          <w:noProof/>
           <w:sz w:val="28"/>
           <w:szCs w:val="28"/>
           <w:lang w:val="de-DE"/>
@@ -4948,7 +5855,7 @@
                     <pic:cNvPicPr/>
                   </pic:nvPicPr>
                   <pic:blipFill>
-                    <a:blip r:embed="rId16"/>
+                    <a:blip r:embed="rId17"/>
                     <a:stretch>
                       <a:fillRect/>
                     </a:stretch>
@@ -5040,6 +5947,7 @@
       <w:r>
         <w:rPr>
           <w:rFonts w:ascii="Calibri" w:hAnsi="Calibri" w:cs="Calibri"/>
+          <w:noProof/>
           <w:sz w:val="28"/>
           <w:szCs w:val="28"/>
           <w:lang w:val="de-DE"/>
@@ -5061,7 +5969,7 @@
                     <pic:cNvPicPr/>
                   </pic:nvPicPr>
                   <pic:blipFill>
-                    <a:blip r:embed="rId17"/>
+                    <a:blip r:embed="rId18"/>
                     <a:stretch>
                       <a:fillRect/>
                     </a:stretch>
@@ -5084,12 +5992,14 @@
       <w:r>
         <w:rPr>
           <w:noProof/>
+          <w:lang w:val="de-DE"/>
         </w:rPr>
         <w:t xml:space="preserve"> </w:t>
       </w:r>
       <w:r>
         <w:rPr>
           <w:rFonts w:ascii="Calibri" w:hAnsi="Calibri" w:cs="Calibri"/>
+          <w:noProof/>
           <w:sz w:val="28"/>
           <w:szCs w:val="28"/>
           <w:lang w:val="de-DE"/>
@@ -5110,7 +6020,7 @@
                     <pic:cNvPicPr/>
                   </pic:nvPicPr>
                   <pic:blipFill>
-                    <a:blip r:embed="rId18"/>
+                    <a:blip r:embed="rId19"/>
                     <a:stretch>
                       <a:fillRect/>
                     </a:stretch>
@@ -5161,18 +6071,7 @@
           <w:szCs w:val="28"/>
           <w:lang w:val="de-DE"/>
         </w:rPr>
-        <w:t>usb_escalating_recover</w:t>
-      </w:r>
-      <w:r>
-        <w:rPr>
-          <w:rFonts w:ascii="Calibri" w:hAnsi="Calibri" w:cs="Calibri"/>
-          <w:b/>
-          <w:bCs/>
-          <w:sz w:val="28"/>
-          <w:szCs w:val="28"/>
-          <w:lang w:val="de-DE"/>
-        </w:rPr>
-        <w:t xml:space="preserve">() </w:t>
+        <w:t xml:space="preserve">usb_escalating_recover() </w:t>
       </w:r>
       <w:r>
         <w:rPr>
@@ -5310,6 +6209,7 @@
       <w:r>
         <w:rPr>
           <w:rFonts w:ascii="Calibri" w:hAnsi="Calibri" w:cs="Calibri"/>
+          <w:noProof/>
           <w:sz w:val="28"/>
           <w:szCs w:val="28"/>
           <w:lang w:val="de-DE"/>
@@ -5330,7 +6230,7 @@
                     <pic:cNvPicPr/>
                   </pic:nvPicPr>
                   <pic:blipFill>
-                    <a:blip r:embed="rId19"/>
+                    <a:blip r:embed="rId20"/>
                     <a:stretch>
                       <a:fillRect/>
                     </a:stretch>
@@ -5503,6 +6403,7 @@
       <w:r>
         <w:rPr>
           <w:rFonts w:ascii="Calibri" w:hAnsi="Calibri" w:cs="Calibri"/>
+          <w:noProof/>
           <w:sz w:val="28"/>
           <w:szCs w:val="28"/>
           <w:lang w:val="de-DE"/>
@@ -5523,7 +6424,7 @@
                     <pic:cNvPicPr/>
                   </pic:nvPicPr>
                   <pic:blipFill>
-                    <a:blip r:embed="rId20"/>
+                    <a:blip r:embed="rId21"/>
                     <a:stretch>
                       <a:fillRect/>
                     </a:stretch>
@@ -5546,12 +6447,14 @@
       <w:r>
         <w:rPr>
           <w:noProof/>
+          <w:lang w:val="de-DE"/>
         </w:rPr>
         <w:t xml:space="preserve"> </w:t>
       </w:r>
       <w:r>
         <w:rPr>
           <w:rFonts w:ascii="Calibri" w:hAnsi="Calibri" w:cs="Calibri"/>
+          <w:noProof/>
           <w:sz w:val="28"/>
           <w:szCs w:val="28"/>
           <w:lang w:val="de-DE"/>
@@ -5572,7 +6475,7 @@
                     <pic:cNvPicPr/>
                   </pic:nvPicPr>
                   <pic:blipFill>
-                    <a:blip r:embed="rId21"/>
+                    <a:blip r:embed="rId22"/>
                     <a:stretch>
                       <a:fillRect/>
                     </a:stretch>
@@ -5792,18 +6695,7 @@
           <w:szCs w:val="28"/>
           <w:lang w:val="de-DE"/>
         </w:rPr>
-        <w:t>Handler</w:t>
-      </w:r>
-      <w:r>
-        <w:rPr>
-          <w:rFonts w:ascii="Calibri" w:hAnsi="Calibri" w:cs="Calibri"/>
-          <w:b/>
-          <w:bCs/>
-          <w:sz w:val="28"/>
-          <w:szCs w:val="28"/>
-          <w:lang w:val="de-DE"/>
-        </w:rPr>
-        <w:t>(BaseHTTPRequestHandler)</w:t>
+        <w:t>Handler(BaseHTTPRequestHandler)</w:t>
       </w:r>
       <w:r>
         <w:rPr>
@@ -5993,6 +6885,7 @@
       <w:r>
         <w:rPr>
           <w:rFonts w:ascii="Calibri" w:hAnsi="Calibri" w:cs="Calibri"/>
+          <w:noProof/>
           <w:sz w:val="28"/>
           <w:szCs w:val="28"/>
           <w:lang w:val="de-DE"/>
@@ -6014,7 +6907,7 @@
                     <pic:cNvPicPr/>
                   </pic:nvPicPr>
                   <pic:blipFill>
-                    <a:blip r:embed="rId22"/>
+                    <a:blip r:embed="rId23"/>
                     <a:stretch>
                       <a:fillRect/>
                     </a:stretch>
@@ -6141,6 +7034,7 @@
       <w:r>
         <w:rPr>
           <w:rFonts w:ascii="Calibri" w:hAnsi="Calibri" w:cs="Calibri"/>
+          <w:noProof/>
           <w:sz w:val="28"/>
           <w:szCs w:val="28"/>
           <w:lang w:val="de-DE"/>
@@ -6161,7 +7055,7 @@
                     <pic:cNvPicPr/>
                   </pic:nvPicPr>
                   <pic:blipFill>
-                    <a:blip r:embed="rId23"/>
+                    <a:blip r:embed="rId24"/>
                     <a:stretch>
                       <a:fillRect/>
                     </a:stretch>
@@ -6297,18 +7191,7 @@
           <w:szCs w:val="28"/>
           <w:lang w:val="de-DE"/>
         </w:rPr>
-        <w:t>ClewareClientConfig</w:t>
-      </w:r>
-      <w:r>
-        <w:rPr>
-          <w:rFonts w:ascii="Calibri" w:hAnsi="Calibri" w:cs="Calibri"/>
-          <w:b/>
-          <w:bCs/>
-          <w:sz w:val="28"/>
-          <w:szCs w:val="28"/>
-          <w:lang w:val="de-DE"/>
-        </w:rPr>
-        <w:t>.ini</w:t>
+        <w:t>ClewareClientConfig.ini</w:t>
       </w:r>
       <w:r>
         <w:rPr>
@@ -6480,11 +7363,13 @@
         <w:jc w:val="both"/>
         <w:rPr>
           <w:noProof/>
-        </w:rPr>
-      </w:pPr>
-      <w:r>
-        <w:rPr>
-          <w:rFonts w:ascii="Calibri" w:hAnsi="Calibri" w:cs="Calibri"/>
+          <w:lang w:val="de-DE"/>
+        </w:rPr>
+      </w:pPr>
+      <w:r>
+        <w:rPr>
+          <w:rFonts w:ascii="Calibri" w:hAnsi="Calibri" w:cs="Calibri"/>
+          <w:noProof/>
           <w:sz w:val="28"/>
           <w:szCs w:val="28"/>
           <w:lang w:val="de-DE"/>
@@ -6505,7 +7390,7 @@
                     <pic:cNvPicPr/>
                   </pic:nvPicPr>
                   <pic:blipFill>
-                    <a:blip r:embed="rId24"/>
+                    <a:blip r:embed="rId25"/>
                     <a:stretch>
                       <a:fillRect/>
                     </a:stretch>
@@ -6528,12 +7413,14 @@
       <w:r>
         <w:rPr>
           <w:noProof/>
+          <w:lang w:val="de-DE"/>
         </w:rPr>
         <w:t xml:space="preserve"> </w:t>
       </w:r>
       <w:r>
         <w:rPr>
           <w:rFonts w:ascii="Calibri" w:hAnsi="Calibri" w:cs="Calibri"/>
+          <w:noProof/>
           <w:sz w:val="28"/>
           <w:szCs w:val="28"/>
           <w:lang w:val="de-DE"/>
@@ -6554,7 +7441,7 @@
                     <pic:cNvPicPr/>
                   </pic:nvPicPr>
                   <pic:blipFill>
-                    <a:blip r:embed="rId25"/>
+                    <a:blip r:embed="rId26"/>
                     <a:stretch>
                       <a:fillRect/>
                     </a:stretch>
@@ -6652,6 +7539,7 @@
       <w:r>
         <w:rPr>
           <w:rFonts w:ascii="Calibri" w:hAnsi="Calibri" w:cs="Calibri"/>
+          <w:noProof/>
           <w:sz w:val="28"/>
           <w:szCs w:val="28"/>
           <w:lang w:val="de-DE"/>
@@ -6672,7 +7560,7 @@
                     <pic:cNvPicPr/>
                   </pic:nvPicPr>
                   <pic:blipFill>
-                    <a:blip r:embed="rId26">
+                    <a:blip r:embed="rId27">
                       <a:extLst>
                         <a:ext uri="{28A0092B-C50C-407E-A947-70E740481C1C}">
                           <a14:useLocalDpi xmlns:a14="http://schemas.microsoft.com/office/drawing/2010/main" val="0"/>
@@ -6701,12 +7589,14 @@
       <w:r>
         <w:rPr>
           <w:noProof/>
+          <w:lang w:val="de-DE"/>
         </w:rPr>
         <w:t xml:space="preserve"> </w:t>
       </w:r>
       <w:r>
         <w:rPr>
           <w:rFonts w:ascii="Calibri" w:hAnsi="Calibri" w:cs="Calibri"/>
+          <w:noProof/>
           <w:sz w:val="28"/>
           <w:szCs w:val="28"/>
           <w:lang w:val="de-DE"/>
@@ -6727,7 +7617,7 @@
                     <pic:cNvPicPr/>
                   </pic:nvPicPr>
                   <pic:blipFill>
-                    <a:blip r:embed="rId27"/>
+                    <a:blip r:embed="rId28"/>
                     <a:stretch>
                       <a:fillRect/>
                     </a:stretch>
@@ -6806,6 +7696,7 @@
       <w:r>
         <w:rPr>
           <w:rFonts w:ascii="Calibri" w:hAnsi="Calibri" w:cs="Calibri"/>
+          <w:noProof/>
           <w:sz w:val="28"/>
           <w:szCs w:val="28"/>
           <w:lang w:val="de-DE"/>
@@ -6826,7 +7717,7 @@
                     <pic:cNvPicPr/>
                   </pic:nvPicPr>
                   <pic:blipFill>
-                    <a:blip r:embed="rId28"/>
+                    <a:blip r:embed="rId29"/>
                     <a:stretch>
                       <a:fillRect/>
                     </a:stretch>
@@ -6924,6 +7815,7 @@
       <w:r>
         <w:rPr>
           <w:rFonts w:ascii="Calibri" w:hAnsi="Calibri" w:cs="Calibri"/>
+          <w:noProof/>
           <w:sz w:val="28"/>
           <w:szCs w:val="28"/>
           <w:lang w:val="de-DE"/>
@@ -6944,7 +7836,7 @@
                     <pic:cNvPicPr/>
                   </pic:nvPicPr>
                   <pic:blipFill>
-                    <a:blip r:embed="rId29"/>
+                    <a:blip r:embed="rId30"/>
                     <a:stretch>
                       <a:fillRect/>
                     </a:stretch>
@@ -7096,18 +7988,7 @@
           <w:lang w:val="de-DE"/>
         </w:rPr>
         <w:lastRenderedPageBreak/>
-        <w:t>ClewareUSBLib.py</w:t>
-      </w:r>
-      <w:r>
-        <w:rPr>
-          <w:rFonts w:ascii="Calibri" w:hAnsi="Calibri" w:cs="Calibri"/>
-          <w:b/>
-          <w:bCs/>
-          <w:sz w:val="28"/>
-          <w:szCs w:val="28"/>
-          <w:lang w:val="de-DE"/>
-        </w:rPr>
-        <w:t>: Schnittstelle zu Cleware Geräte</w:t>
+        <w:t>ClewareUSBLib.py: Schnittstelle zu Cleware Geräte</w:t>
       </w:r>
     </w:p>
     <w:p>
@@ -7245,6 +8126,7 @@
       <w:r>
         <w:rPr>
           <w:rFonts w:ascii="Calibri" w:hAnsi="Calibri" w:cs="Calibri"/>
+          <w:noProof/>
           <w:sz w:val="28"/>
           <w:szCs w:val="28"/>
           <w:lang w:val="de-DE"/>
@@ -7265,7 +8147,7 @@
                     <pic:cNvPicPr/>
                   </pic:nvPicPr>
                   <pic:blipFill>
-                    <a:blip r:embed="rId30"/>
+                    <a:blip r:embed="rId31"/>
                     <a:stretch>
                       <a:fillRect/>
                     </a:stretch>
@@ -7287,8 +8169,8 @@
       </w:r>
     </w:p>
     <w:sectPr>
-      <w:headerReference w:type="default" r:id="rId31"/>
-      <w:footerReference w:type="default" r:id="rId32"/>
+      <w:headerReference w:type="default" r:id="rId32"/>
+      <w:footerReference w:type="default" r:id="rId33"/>
       <w:type w:val="continuous"/>
       <w:pgSz w:w="11906" w:h="16838" w:code="9"/>
       <w:pgMar w:top="1361" w:right="1274" w:bottom="1077" w:left="1134" w:header="340" w:footer="340" w:gutter="0"/>
@@ -7337,13 +8219,7 @@
       <w:rPr>
         <w:lang w:val="de-DE"/>
       </w:rPr>
-      <w:t>Verfasst von: Tchimnang Mikiadje Alain Rodrigue (</w:t>
-    </w:r>
-    <w:r>
-      <w:rPr>
-        <w:lang w:val="de-DE"/>
-      </w:rPr>
-      <w:t>alainrodrigue.tchimnangmikiadje@siemens-healthineers.com</w:t>
+      <w:t>Verfasst von: Tchimnang Mikiadje Alain Rodrigue (alainrodrigue.tchimnangmikiadje@siemens-healthineers.com</w:t>
     </w:r>
     <w:r>
       <w:rPr>
@@ -7599,6 +8475,97 @@
     </w:lvl>
   </w:abstractNum>
   <w:abstractNum w:abstractNumId="10" w15:restartNumberingAfterBreak="0">
+    <w:nsid w:val="1094347B"/>
+    <w:multiLevelType w:val="hybridMultilevel"/>
+    <w:tmpl w:val="BD1EDDEA"/>
+    <w:lvl w:ilvl="0" w:tplc="04090001">
+      <w:start w:val="1"/>
+      <w:numFmt w:val="bullet"/>
+      <w:lvlText w:val=""/>
+      <w:lvlJc w:val="left"/>
+      <w:pPr>
+        <w:ind w:left="790" w:hanging="360"/>
+      </w:pPr>
+      <w:rPr>
+        <w:rFonts w:ascii="Symbol" w:hAnsi="Symbol" w:hint="default"/>
+        <w:b/>
+        <w:bCs/>
+      </w:rPr>
+    </w:lvl>
+    <w:lvl w:ilvl="1" w:tplc="FFFFFFFF" w:tentative="1">
+      <w:start w:val="1"/>
+      <w:numFmt w:val="lowerLetter"/>
+      <w:lvlText w:val="%2."/>
+      <w:lvlJc w:val="left"/>
+      <w:pPr>
+        <w:ind w:left="1510" w:hanging="360"/>
+      </w:pPr>
+    </w:lvl>
+    <w:lvl w:ilvl="2" w:tplc="FFFFFFFF" w:tentative="1">
+      <w:start w:val="1"/>
+      <w:numFmt w:val="lowerRoman"/>
+      <w:lvlText w:val="%3."/>
+      <w:lvlJc w:val="right"/>
+      <w:pPr>
+        <w:ind w:left="2230" w:hanging="180"/>
+      </w:pPr>
+    </w:lvl>
+    <w:lvl w:ilvl="3" w:tplc="FFFFFFFF" w:tentative="1">
+      <w:start w:val="1"/>
+      <w:numFmt w:val="decimal"/>
+      <w:lvlText w:val="%4."/>
+      <w:lvlJc w:val="left"/>
+      <w:pPr>
+        <w:ind w:left="2950" w:hanging="360"/>
+      </w:pPr>
+    </w:lvl>
+    <w:lvl w:ilvl="4" w:tplc="FFFFFFFF" w:tentative="1">
+      <w:start w:val="1"/>
+      <w:numFmt w:val="lowerLetter"/>
+      <w:lvlText w:val="%5."/>
+      <w:lvlJc w:val="left"/>
+      <w:pPr>
+        <w:ind w:left="3670" w:hanging="360"/>
+      </w:pPr>
+    </w:lvl>
+    <w:lvl w:ilvl="5" w:tplc="FFFFFFFF" w:tentative="1">
+      <w:start w:val="1"/>
+      <w:numFmt w:val="lowerRoman"/>
+      <w:lvlText w:val="%6."/>
+      <w:lvlJc w:val="right"/>
+      <w:pPr>
+        <w:ind w:left="4390" w:hanging="180"/>
+      </w:pPr>
+    </w:lvl>
+    <w:lvl w:ilvl="6" w:tplc="FFFFFFFF" w:tentative="1">
+      <w:start w:val="1"/>
+      <w:numFmt w:val="decimal"/>
+      <w:lvlText w:val="%7."/>
+      <w:lvlJc w:val="left"/>
+      <w:pPr>
+        <w:ind w:left="5110" w:hanging="360"/>
+      </w:pPr>
+    </w:lvl>
+    <w:lvl w:ilvl="7" w:tplc="FFFFFFFF" w:tentative="1">
+      <w:start w:val="1"/>
+      <w:numFmt w:val="lowerLetter"/>
+      <w:lvlText w:val="%8."/>
+      <w:lvlJc w:val="left"/>
+      <w:pPr>
+        <w:ind w:left="5830" w:hanging="360"/>
+      </w:pPr>
+    </w:lvl>
+    <w:lvl w:ilvl="8" w:tplc="FFFFFFFF" w:tentative="1">
+      <w:start w:val="1"/>
+      <w:numFmt w:val="lowerRoman"/>
+      <w:lvlText w:val="%9."/>
+      <w:lvlJc w:val="right"/>
+      <w:pPr>
+        <w:ind w:left="6550" w:hanging="180"/>
+      </w:pPr>
+    </w:lvl>
+  </w:abstractNum>
+  <w:abstractNum w:abstractNumId="11" w15:restartNumberingAfterBreak="0">
     <w:nsid w:val="18DA1600"/>
     <w:multiLevelType w:val="hybridMultilevel"/>
     <w:tmpl w:val="84B0E832"/>
@@ -7684,7 +8651,7 @@
       </w:pPr>
     </w:lvl>
   </w:abstractNum>
-  <w:abstractNum w:abstractNumId="11" w15:restartNumberingAfterBreak="0">
+  <w:abstractNum w:abstractNumId="12" w15:restartNumberingAfterBreak="0">
     <w:nsid w:val="19A2160A"/>
     <w:multiLevelType w:val="hybridMultilevel"/>
     <w:tmpl w:val="D1DA3802"/>
@@ -7797,7 +8764,120 @@
       </w:rPr>
     </w:lvl>
   </w:abstractNum>
-  <w:abstractNum w:abstractNumId="12" w15:restartNumberingAfterBreak="0">
+  <w:abstractNum w:abstractNumId="13" w15:restartNumberingAfterBreak="0">
+    <w:nsid w:val="19BC05CC"/>
+    <w:multiLevelType w:val="hybridMultilevel"/>
+    <w:tmpl w:val="45785A2C"/>
+    <w:lvl w:ilvl="0" w:tplc="04090001">
+      <w:start w:val="1"/>
+      <w:numFmt w:val="bullet"/>
+      <w:lvlText w:val=""/>
+      <w:lvlJc w:val="left"/>
+      <w:pPr>
+        <w:ind w:left="1150" w:hanging="360"/>
+      </w:pPr>
+      <w:rPr>
+        <w:rFonts w:ascii="Symbol" w:hAnsi="Symbol" w:hint="default"/>
+      </w:rPr>
+    </w:lvl>
+    <w:lvl w:ilvl="1" w:tplc="04090003" w:tentative="1">
+      <w:start w:val="1"/>
+      <w:numFmt w:val="bullet"/>
+      <w:lvlText w:val="o"/>
+      <w:lvlJc w:val="left"/>
+      <w:pPr>
+        <w:ind w:left="1870" w:hanging="360"/>
+      </w:pPr>
+      <w:rPr>
+        <w:rFonts w:ascii="Courier New" w:hAnsi="Courier New" w:cs="Courier New" w:hint="default"/>
+      </w:rPr>
+    </w:lvl>
+    <w:lvl w:ilvl="2" w:tplc="04090005" w:tentative="1">
+      <w:start w:val="1"/>
+      <w:numFmt w:val="bullet"/>
+      <w:lvlText w:val=""/>
+      <w:lvlJc w:val="left"/>
+      <w:pPr>
+        <w:ind w:left="2590" w:hanging="360"/>
+      </w:pPr>
+      <w:rPr>
+        <w:rFonts w:ascii="Wingdings" w:hAnsi="Wingdings" w:hint="default"/>
+      </w:rPr>
+    </w:lvl>
+    <w:lvl w:ilvl="3" w:tplc="04090001" w:tentative="1">
+      <w:start w:val="1"/>
+      <w:numFmt w:val="bullet"/>
+      <w:lvlText w:val=""/>
+      <w:lvlJc w:val="left"/>
+      <w:pPr>
+        <w:ind w:left="3310" w:hanging="360"/>
+      </w:pPr>
+      <w:rPr>
+        <w:rFonts w:ascii="Symbol" w:hAnsi="Symbol" w:hint="default"/>
+      </w:rPr>
+    </w:lvl>
+    <w:lvl w:ilvl="4" w:tplc="04090003" w:tentative="1">
+      <w:start w:val="1"/>
+      <w:numFmt w:val="bullet"/>
+      <w:lvlText w:val="o"/>
+      <w:lvlJc w:val="left"/>
+      <w:pPr>
+        <w:ind w:left="4030" w:hanging="360"/>
+      </w:pPr>
+      <w:rPr>
+        <w:rFonts w:ascii="Courier New" w:hAnsi="Courier New" w:cs="Courier New" w:hint="default"/>
+      </w:rPr>
+    </w:lvl>
+    <w:lvl w:ilvl="5" w:tplc="04090005" w:tentative="1">
+      <w:start w:val="1"/>
+      <w:numFmt w:val="bullet"/>
+      <w:lvlText w:val=""/>
+      <w:lvlJc w:val="left"/>
+      <w:pPr>
+        <w:ind w:left="4750" w:hanging="360"/>
+      </w:pPr>
+      <w:rPr>
+        <w:rFonts w:ascii="Wingdings" w:hAnsi="Wingdings" w:hint="default"/>
+      </w:rPr>
+    </w:lvl>
+    <w:lvl w:ilvl="6" w:tplc="04090001" w:tentative="1">
+      <w:start w:val="1"/>
+      <w:numFmt w:val="bullet"/>
+      <w:lvlText w:val=""/>
+      <w:lvlJc w:val="left"/>
+      <w:pPr>
+        <w:ind w:left="5470" w:hanging="360"/>
+      </w:pPr>
+      <w:rPr>
+        <w:rFonts w:ascii="Symbol" w:hAnsi="Symbol" w:hint="default"/>
+      </w:rPr>
+    </w:lvl>
+    <w:lvl w:ilvl="7" w:tplc="04090003" w:tentative="1">
+      <w:start w:val="1"/>
+      <w:numFmt w:val="bullet"/>
+      <w:lvlText w:val="o"/>
+      <w:lvlJc w:val="left"/>
+      <w:pPr>
+        <w:ind w:left="6190" w:hanging="360"/>
+      </w:pPr>
+      <w:rPr>
+        <w:rFonts w:ascii="Courier New" w:hAnsi="Courier New" w:cs="Courier New" w:hint="default"/>
+      </w:rPr>
+    </w:lvl>
+    <w:lvl w:ilvl="8" w:tplc="04090005" w:tentative="1">
+      <w:start w:val="1"/>
+      <w:numFmt w:val="bullet"/>
+      <w:lvlText w:val=""/>
+      <w:lvlJc w:val="left"/>
+      <w:pPr>
+        <w:ind w:left="6910" w:hanging="360"/>
+      </w:pPr>
+      <w:rPr>
+        <w:rFonts w:ascii="Wingdings" w:hAnsi="Wingdings" w:hint="default"/>
+      </w:rPr>
+    </w:lvl>
+  </w:abstractNum>
+  <w:abstractNum w:abstractNumId="14" w15:restartNumberingAfterBreak="0">
     <w:nsid w:val="1DF16FD0"/>
     <w:multiLevelType w:val="hybridMultilevel"/>
     <w:tmpl w:val="90627BAE"/>
@@ -7883,7 +8963,7 @@
       </w:pPr>
     </w:lvl>
   </w:abstractNum>
-  <w:abstractNum w:abstractNumId="13" w15:restartNumberingAfterBreak="0">
+  <w:abstractNum w:abstractNumId="15" w15:restartNumberingAfterBreak="0">
     <w:nsid w:val="202A2222"/>
     <w:multiLevelType w:val="hybridMultilevel"/>
     <w:tmpl w:val="FB22D3B4"/>
@@ -7995,7 +9075,7 @@
       </w:rPr>
     </w:lvl>
   </w:abstractNum>
-  <w:abstractNum w:abstractNumId="14" w15:restartNumberingAfterBreak="0">
+  <w:abstractNum w:abstractNumId="16" w15:restartNumberingAfterBreak="0">
     <w:nsid w:val="29CE6DDC"/>
     <w:multiLevelType w:val="hybridMultilevel"/>
     <w:tmpl w:val="A2425038"/>
@@ -8108,7 +9188,7 @@
       </w:rPr>
     </w:lvl>
   </w:abstractNum>
-  <w:abstractNum w:abstractNumId="15" w15:restartNumberingAfterBreak="0">
+  <w:abstractNum w:abstractNumId="17" w15:restartNumberingAfterBreak="0">
     <w:nsid w:val="347C3596"/>
     <w:multiLevelType w:val="hybridMultilevel"/>
     <w:tmpl w:val="6A0A95A4"/>
@@ -8199,7 +9279,7 @@
       </w:pPr>
     </w:lvl>
   </w:abstractNum>
-  <w:abstractNum w:abstractNumId="16" w15:restartNumberingAfterBreak="0">
+  <w:abstractNum w:abstractNumId="18" w15:restartNumberingAfterBreak="0">
     <w:nsid w:val="38A600AD"/>
     <w:multiLevelType w:val="hybridMultilevel"/>
     <w:tmpl w:val="34A28086"/>
@@ -8290,7 +9370,7 @@
       </w:pPr>
     </w:lvl>
   </w:abstractNum>
-  <w:abstractNum w:abstractNumId="17" w15:restartNumberingAfterBreak="0">
+  <w:abstractNum w:abstractNumId="19" w15:restartNumberingAfterBreak="0">
     <w:nsid w:val="41801936"/>
     <w:multiLevelType w:val="hybridMultilevel"/>
     <w:tmpl w:val="73BED002"/>
@@ -8381,7 +9461,7 @@
       </w:pPr>
     </w:lvl>
   </w:abstractNum>
-  <w:abstractNum w:abstractNumId="18" w15:restartNumberingAfterBreak="0">
+  <w:abstractNum w:abstractNumId="20" w15:restartNumberingAfterBreak="0">
     <w:nsid w:val="4855369B"/>
     <w:multiLevelType w:val="hybridMultilevel"/>
     <w:tmpl w:val="A9802992"/>
@@ -8496,7 +9576,7 @@
       </w:rPr>
     </w:lvl>
   </w:abstractNum>
-  <w:abstractNum w:abstractNumId="19" w15:restartNumberingAfterBreak="0">
+  <w:abstractNum w:abstractNumId="21" w15:restartNumberingAfterBreak="0">
     <w:nsid w:val="582F50AA"/>
     <w:multiLevelType w:val="hybridMultilevel"/>
     <w:tmpl w:val="CCE271F6"/>
@@ -8585,7 +9665,7 @@
       </w:pPr>
     </w:lvl>
   </w:abstractNum>
-  <w:abstractNum w:abstractNumId="20" w15:restartNumberingAfterBreak="0">
+  <w:abstractNum w:abstractNumId="22" w15:restartNumberingAfterBreak="0">
     <w:nsid w:val="6295461A"/>
     <w:multiLevelType w:val="hybridMultilevel"/>
     <w:tmpl w:val="28FA4A72"/>
@@ -8671,7 +9751,7 @@
       </w:pPr>
     </w:lvl>
   </w:abstractNum>
-  <w:abstractNum w:abstractNumId="21" w15:restartNumberingAfterBreak="0">
+  <w:abstractNum w:abstractNumId="23" w15:restartNumberingAfterBreak="0">
     <w:nsid w:val="75614C57"/>
     <w:multiLevelType w:val="hybridMultilevel"/>
     <w:tmpl w:val="28E40A18"/>
@@ -8786,7 +9866,7 @@
       </w:rPr>
     </w:lvl>
   </w:abstractNum>
-  <w:abstractNum w:abstractNumId="22" w15:restartNumberingAfterBreak="0">
+  <w:abstractNum w:abstractNumId="24" w15:restartNumberingAfterBreak="0">
     <w:nsid w:val="79447CCD"/>
     <w:multiLevelType w:val="hybridMultilevel"/>
     <w:tmpl w:val="220A1A30"/>
@@ -8930,43 +10010,49 @@
     <w:abstractNumId w:val="9"/>
   </w:num>
   <w:num w:numId="11" w16cid:durableId="136384543">
+    <w:abstractNumId w:val="16"/>
+  </w:num>
+  <w:num w:numId="12" w16cid:durableId="1393892115">
+    <w:abstractNumId w:val="19"/>
+  </w:num>
+  <w:num w:numId="13" w16cid:durableId="1709795366">
+    <w:abstractNumId w:val="17"/>
+  </w:num>
+  <w:num w:numId="14" w16cid:durableId="1042747812">
+    <w:abstractNumId w:val="12"/>
+  </w:num>
+  <w:num w:numId="15" w16cid:durableId="558129740">
+    <w:abstractNumId w:val="20"/>
+  </w:num>
+  <w:num w:numId="16" w16cid:durableId="1533033804">
+    <w:abstractNumId w:val="23"/>
+  </w:num>
+  <w:num w:numId="17" w16cid:durableId="254174567">
+    <w:abstractNumId w:val="24"/>
+  </w:num>
+  <w:num w:numId="18" w16cid:durableId="971180610">
+    <w:abstractNumId w:val="18"/>
+  </w:num>
+  <w:num w:numId="19" w16cid:durableId="832376685">
+    <w:abstractNumId w:val="15"/>
+  </w:num>
+  <w:num w:numId="20" w16cid:durableId="440613902">
     <w:abstractNumId w:val="14"/>
   </w:num>
-  <w:num w:numId="12" w16cid:durableId="1393892115">
-    <w:abstractNumId w:val="17"/>
-  </w:num>
-  <w:num w:numId="13" w16cid:durableId="1709795366">
-    <w:abstractNumId w:val="15"/>
-  </w:num>
-  <w:num w:numId="14" w16cid:durableId="1042747812">
+  <w:num w:numId="21" w16cid:durableId="1323851816">
     <w:abstractNumId w:val="11"/>
   </w:num>
-  <w:num w:numId="15" w16cid:durableId="558129740">
-    <w:abstractNumId w:val="18"/>
+  <w:num w:numId="22" w16cid:durableId="2057268233">
+    <w:abstractNumId w:val="22"/>
   </w:num>
-  <w:num w:numId="16" w16cid:durableId="1533033804">
+  <w:num w:numId="23" w16cid:durableId="1484855109">
     <w:abstractNumId w:val="21"/>
   </w:num>
-  <w:num w:numId="17" w16cid:durableId="254174567">
-    <w:abstractNumId w:val="22"/>
-  </w:num>
-  <w:num w:numId="18" w16cid:durableId="971180610">
-    <w:abstractNumId w:val="16"/>
-  </w:num>
-  <w:num w:numId="19" w16cid:durableId="832376685">
+  <w:num w:numId="24" w16cid:durableId="2120442993">
     <w:abstractNumId w:val="13"/>
   </w:num>
-  <w:num w:numId="20" w16cid:durableId="440613902">
-    <w:abstractNumId w:val="12"/>
-  </w:num>
-  <w:num w:numId="21" w16cid:durableId="1323851816">
+  <w:num w:numId="25" w16cid:durableId="2703689">
     <w:abstractNumId w:val="10"/>
-  </w:num>
-  <w:num w:numId="22" w16cid:durableId="2057268233">
-    <w:abstractNumId w:val="20"/>
-  </w:num>
-  <w:num w:numId="23" w16cid:durableId="1484855109">
-    <w:abstractNumId w:val="19"/>
   </w:num>
 </w:numbering>
 </file>
@@ -10225,6 +11311,21 @@
 </file>
 
 <file path=customXml/item1.xml><?xml version="1.0" encoding="utf-8"?>
+<p:properties xmlns:p="http://schemas.microsoft.com/office/2006/metadata/properties" xmlns:xsi="http://www.w3.org/2001/XMLSchema-instance" xmlns:pc="http://schemas.microsoft.com/office/infopath/2007/PartnerControls">
+  <documentManagement/>
+</p:properties>
+</file>
+
+<file path=customXml/item2.xml><?xml version="1.0" encoding="utf-8"?>
+<?mso-contentType ?>
+<FormTemplates xmlns="http://schemas.microsoft.com/sharepoint/v3/contenttype/forms">
+  <Display>DocumentLibraryForm</Display>
+  <Edit>DocumentLibraryForm</Edit>
+  <New>DocumentLibraryForm</New>
+</FormTemplates>
+</file>
+
+<file path=customXml/item3.xml><?xml version="1.0" encoding="utf-8"?>
 <ct:contentTypeSchema xmlns:ct="http://schemas.microsoft.com/office/2006/metadata/contentType" xmlns:ma="http://schemas.microsoft.com/office/2006/metadata/properties/metaAttributes" ct:_="" ma:_="" ma:contentTypeName="Dokument" ma:contentTypeID="0x0101001252A5FE39765D4BB5E78ADEEA136A30" ma:contentTypeVersion="3" ma:contentTypeDescription="Ein neues Dokument erstellen." ma:contentTypeScope="" ma:versionID="23aecc8110e4b90af41a11a8cc0a898e">
   <xsd:schema xmlns:xsd="http://www.w3.org/2001/XMLSchema" xmlns:xs="http://www.w3.org/2001/XMLSchema" xmlns:p="http://schemas.microsoft.com/office/2006/metadata/properties" xmlns:ns2="a0a871ee-0408-4cc8-b541-0b7ca9279a5a" targetNamespace="http://schemas.microsoft.com/office/2006/metadata/properties" ma:root="true" ma:fieldsID="d745bc7297d766a8870dee6be70d6a40" ns2:_="">
     <xsd:import namespace="a0a871ee-0408-4cc8-b541-0b7ca9279a5a"/>
@@ -10362,26 +11463,28 @@
 </ct:contentTypeSchema>
 </file>
 
-<file path=customXml/item2.xml><?xml version="1.0" encoding="utf-8"?>
-<?mso-contentType ?>
-<FormTemplates xmlns="http://schemas.microsoft.com/sharepoint/v3/contenttype/forms">
-  <Display>DocumentLibraryForm</Display>
-  <Edit>DocumentLibraryForm</Edit>
-  <New>DocumentLibraryForm</New>
-</FormTemplates>
-</file>
-
-<file path=customXml/item3.xml><?xml version="1.0" encoding="utf-8"?>
-<p:properties xmlns:p="http://schemas.microsoft.com/office/2006/metadata/properties" xmlns:xsi="http://www.w3.org/2001/XMLSchema-instance" xmlns:pc="http://schemas.microsoft.com/office/infopath/2007/PartnerControls">
-  <documentManagement/>
-</p:properties>
-</file>
-
 <file path=customXml/item4.xml><?xml version="1.0" encoding="utf-8"?>
 <b:Sources xmlns:b="http://schemas.openxmlformats.org/officeDocument/2006/bibliography" xmlns="http://schemas.openxmlformats.org/officeDocument/2006/bibliography" SelectedStyle="/APASixthEditionOfficeOnline.xsl" StyleName="APA" Version="6"/>
 </file>
 
 <file path=customXml/itemProps1.xml><?xml version="1.0" encoding="utf-8"?>
+<ds:datastoreItem xmlns:ds="http://schemas.openxmlformats.org/officeDocument/2006/customXml" ds:itemID="{0F2A2D94-7967-4251-902B-6E195F973549}">
+  <ds:schemaRefs>
+    <ds:schemaRef ds:uri="http://schemas.microsoft.com/office/2006/metadata/properties"/>
+    <ds:schemaRef ds:uri="http://schemas.microsoft.com/office/infopath/2007/PartnerControls"/>
+  </ds:schemaRefs>
+</ds:datastoreItem>
+</file>
+
+<file path=customXml/itemProps2.xml><?xml version="1.0" encoding="utf-8"?>
+<ds:datastoreItem xmlns:ds="http://schemas.openxmlformats.org/officeDocument/2006/customXml" ds:itemID="{513F6D7B-CB02-4290-84EF-0BD3EA679891}">
+  <ds:schemaRefs>
+    <ds:schemaRef ds:uri="http://schemas.microsoft.com/sharepoint/v3/contenttype/forms"/>
+  </ds:schemaRefs>
+</ds:datastoreItem>
+</file>
+
+<file path=customXml/itemProps3.xml><?xml version="1.0" encoding="utf-8"?>
 <ds:datastoreItem xmlns:ds="http://schemas.openxmlformats.org/officeDocument/2006/customXml" ds:itemID="{40D99768-D24E-4580-8BF5-D7C22BF5496D}">
   <ds:schemaRefs>
     <ds:schemaRef ds:uri="http://schemas.microsoft.com/office/2006/metadata/contentType"/>
@@ -10399,23 +11502,6 @@
 </ds:datastoreItem>
 </file>
 
-<file path=customXml/itemProps2.xml><?xml version="1.0" encoding="utf-8"?>
-<ds:datastoreItem xmlns:ds="http://schemas.openxmlformats.org/officeDocument/2006/customXml" ds:itemID="{513F6D7B-CB02-4290-84EF-0BD3EA679891}">
-  <ds:schemaRefs>
-    <ds:schemaRef ds:uri="http://schemas.microsoft.com/sharepoint/v3/contenttype/forms"/>
-  </ds:schemaRefs>
-</ds:datastoreItem>
-</file>
-
-<file path=customXml/itemProps3.xml><?xml version="1.0" encoding="utf-8"?>
-<ds:datastoreItem xmlns:ds="http://schemas.openxmlformats.org/officeDocument/2006/customXml" ds:itemID="{0F2A2D94-7967-4251-902B-6E195F973549}">
-  <ds:schemaRefs>
-    <ds:schemaRef ds:uri="http://schemas.microsoft.com/office/2006/metadata/properties"/>
-    <ds:schemaRef ds:uri="http://schemas.microsoft.com/office/infopath/2007/PartnerControls"/>
-  </ds:schemaRefs>
-</ds:datastoreItem>
-</file>
-
 <file path=customXml/itemProps4.xml><?xml version="1.0" encoding="utf-8"?>
 <ds:datastoreItem xmlns:ds="http://schemas.openxmlformats.org/officeDocument/2006/customXml" ds:itemID="{75B576C2-10DB-6A42-884F-19DA08B80BAE}">
   <ds:schemaRefs>

</xml_diff>